<commit_message>
small errors in the final proposal word doc
</commit_message>
<xml_diff>
--- a/Documentation/Final_Proposal.docx
+++ b/Documentation/Final_Proposal.docx
@@ -1,6 +1,6 @@
 
 <file path=word/document.xml><?xml version="1.0" encoding="utf-8"?>
-<w:document xmlns:cx="http://schemas.microsoft.com/office/drawing/2014/chartex" xmlns:cx1="http://schemas.microsoft.com/office/drawing/2015/9/8/chartex" xmlns:cx2="http://schemas.microsoft.com/office/drawing/2015/10/21/chartex" xmlns:cx3="http://schemas.microsoft.com/office/drawing/2016/5/9/chartex" xmlns:cx4="http://schemas.microsoft.com/office/drawing/2016/5/10/chartex" xmlns:cx5="http://schemas.microsoft.com/office/drawing/2016/5/11/chartex" xmlns:cx6="http://schemas.microsoft.com/office/drawing/2016/5/12/chartex" xmlns:cx7="http://schemas.microsoft.com/office/drawing/2016/5/13/chartex" xmlns:cx8="http://schemas.microsoft.com/office/drawing/2016/5/14/chartex" xmlns:mc="http://schemas.openxmlformats.org/markup-compatibility/2006" xmlns:aink="http://schemas.microsoft.com/office/drawing/2016/ink" xmlns:am3d="http://schemas.microsoft.com/office/drawing/2017/model3d" xmlns:o="urn:schemas-microsoft-com:office:office" xmlns:oel="http://schemas.microsoft.com/office/2019/extlst" xmlns:r="http://purl.oclc.org/ooxml/officeDocument/relationships" xmlns:m="http://purl.oclc.org/ooxml/officeDocument/math" xmlns:v="urn:schemas-microsoft-com:vml" xmlns:wp14="http://schemas.microsoft.com/office/word/2010/wordprocessingDrawing" xmlns:wp="http://purl.oclc.org/ooxml/drawingml/wordprocessingDrawing" xmlns:w10="urn:schemas-microsoft-com:office:word" xmlns:w="http://purl.oclc.org/ooxml/wordprocessingml/main" xmlns:w14="http://schemas.microsoft.com/office/word/2010/wordml" xmlns:w15="http://schemas.microsoft.com/office/word/2012/wordml" xmlns:w16cex="http://schemas.microsoft.com/office/word/2018/wordml/cex" xmlns:w16cid="http://schemas.microsoft.com/office/word/2016/wordml/cid" xmlns:w16="http://schemas.microsoft.com/office/word/2018/wordml" xmlns:w16du="http://schemas.microsoft.com/office/word/2023/wordml/word16du" xmlns:w16sdtdh="http://schemas.microsoft.com/office/word/2020/wordml/sdtdatahash" xmlns:w16sdtfl="http://schemas.microsoft.com/office/word/2024/wordml/sdtformatlock" xmlns:w16se="http://schemas.microsoft.com/office/word/2015/wordml/symex" xmlns:wpi="http://schemas.microsoft.com/office/word/2010/wordprocessingInk" xmlns:wne="http://schemas.microsoft.com/office/word/2006/wordml" mc:Ignorable="w14 w15 w16se w16cid w16 w16cex w16sdtdh w16sdtfl w16du wne wp14" w:conformance="strict">
+<w:document xmlns:cx="http://schemas.microsoft.com/office/drawing/2014/chartex" xmlns:cx1="http://schemas.microsoft.com/office/drawing/2015/9/8/chartex" xmlns:mc="http://schemas.openxmlformats.org/markup-compatibility/2006" xmlns:o="urn:schemas-microsoft-com:office:office" xmlns:r="http://purl.oclc.org/ooxml/officeDocument/relationships" xmlns:m="http://purl.oclc.org/ooxml/officeDocument/math" xmlns:v="urn:schemas-microsoft-com:vml" xmlns:wp14="http://schemas.microsoft.com/office/word/2010/wordprocessingDrawing" xmlns:wp="http://purl.oclc.org/ooxml/drawingml/wordprocessingDrawing" xmlns:w10="urn:schemas-microsoft-com:office:word" xmlns:w="http://purl.oclc.org/ooxml/wordprocessingml/main" xmlns:w14="http://schemas.microsoft.com/office/word/2010/wordml" xmlns:w15="http://schemas.microsoft.com/office/word/2012/wordml" xmlns:w16se="http://schemas.microsoft.com/office/word/2015/wordml/symex" xmlns:wpi="http://schemas.microsoft.com/office/word/2010/wordprocessingInk" xmlns:wne="http://schemas.microsoft.com/office/word/2006/wordml" mc:Ignorable="w14 w15 w16se wne wp14" w:conformance="strict">
   <w:body>
     <w:p>
       <w:pPr>
@@ -61,6 +61,7 @@
           <w:sz w:val="18"/>
           <w:szCs w:val="18"/>
         </w:rPr>
+        <w:lastRenderedPageBreak/>
         <w:t>Christian Yankacar</w:t>
       </w:r>
     </w:p>
@@ -99,6 +100,7 @@
           <w:sz w:val="18"/>
           <w:szCs w:val="18"/>
         </w:rPr>
+        <w:lastRenderedPageBreak/>
         <w:t xml:space="preserve"> </w:t>
       </w:r>
     </w:p>
@@ -115,6 +117,7 @@
         <w:br w:type="column"/>
       </w:r>
       <w:r>
+        <w:lastRenderedPageBreak/>
         <w:t xml:space="preserve"> </w:t>
       </w:r>
     </w:p>
@@ -140,6 +143,7 @@
         </w:sectPr>
       </w:pPr>
       <w:r>
+        <w:lastRenderedPageBreak/>
         <w:br w:type="column"/>
       </w:r>
     </w:p>
@@ -156,6 +160,7 @@
           <w:i/>
           <w:iCs/>
         </w:rPr>
+        <w:lastRenderedPageBreak/>
         <w:t>Abstract</w:t>
       </w:r>
       <w:r>
@@ -172,7 +177,7 @@
     </w:p>
     <w:p>
       <w:pPr>
-        <w:pStyle w:val="berschrift1"/>
+        <w:pStyle w:val="Heading1"/>
       </w:pPr>
       <w:r>
         <w:t xml:space="preserve">Introduction </w:t>
@@ -180,7 +185,7 @@
     </w:p>
     <w:p>
       <w:pPr>
-        <w:pStyle w:val="Textkrper"/>
+        <w:pStyle w:val="BodyText"/>
         <w:rPr>
           <w:lang w:val="en-US"/>
         </w:rPr>
@@ -209,6 +214,7 @@
             <w:docPart w:val="482DD34A552843CA9F1513CEAE196551"/>
           </w:placeholder>
         </w:sdtPr>
+        <w:sdtEndPr/>
         <w:sdtContent>
           <w:r>
             <w:rPr>
@@ -260,6 +266,7 @@
             <w:docPart w:val="482DD34A552843CA9F1513CEAE196551"/>
           </w:placeholder>
         </w:sdtPr>
+        <w:sdtEndPr/>
         <w:sdtContent>
           <w:r>
             <w:rPr>
@@ -311,6 +318,7 @@
             <w:docPart w:val="482DD34A552843CA9F1513CEAE196551"/>
           </w:placeholder>
         </w:sdtPr>
+        <w:sdtEndPr/>
         <w:sdtContent>
           <w:r>
             <w:rPr>
@@ -362,6 +370,7 @@
             <w:docPart w:val="482DD34A552843CA9F1513CEAE196551"/>
           </w:placeholder>
         </w:sdtPr>
+        <w:sdtEndPr/>
         <w:sdtContent>
           <w:r>
             <w:rPr>
@@ -405,12 +414,13 @@
         <w:rPr>
           <w:lang w:val="en-US"/>
         </w:rPr>
+        <w:lastRenderedPageBreak/>
         <w:t xml:space="preserve">introduced a unified latent space where object O and grasp G where modeled as a joint probability P(G, O). The authors show that this latent space allows for training both the conditional generation of objects and grasps. While this approach is interesting, we want to develop a direct strategy by directly training the diffusion model to learn the conditional probability of generating objects from a given grasp P(O|G) and compare our results to UGG. </w:t>
       </w:r>
     </w:p>
     <w:p>
       <w:pPr>
-        <w:pStyle w:val="berschrift1"/>
+        <w:pStyle w:val="Heading1"/>
       </w:pPr>
       <w:r>
         <w:t>Technical Outline</w:t>
@@ -432,6 +442,7 @@
             <w:docPart w:val="974F459B38BE4EC4B15956B314CF5259"/>
           </w:placeholder>
         </w:sdtPr>
+        <w:sdtEndPr/>
         <w:sdtContent>
           <w:r>
             <w:fldChar w:fldCharType="begin"/>
@@ -462,6 +473,7 @@
             <w:docPart w:val="974F459B38BE4EC4B15956B314CF5259"/>
           </w:placeholder>
         </w:sdtPr>
+        <w:sdtEndPr/>
         <w:sdtContent>
           <w:r>
             <w:fldChar w:fldCharType="begin"/>
@@ -492,6 +504,7 @@
             <w:docPart w:val="974F459B38BE4EC4B15956B314CF5259"/>
           </w:placeholder>
         </w:sdtPr>
+        <w:sdtEndPr/>
         <w:sdtContent>
           <w:r>
             <w:fldChar w:fldCharType="begin"/>
@@ -511,15 +524,7 @@
         </w:sdtContent>
       </w:sdt>
       <w:r>
-        <w:t xml:space="preserve">. So we want to stick with point clouds as well, as there is much groundwork that we can rely on from past works and point clouds represent a budget friendly way of modeling the surface of a 3d object. For latent diffusion the VAE is of great importance as it generates the latent codes to perform the diffusion on. For our work we would like to experiment with different VAEs. </w:t>
-      </w:r>
-      <w:proofErr w:type="spellStart"/>
-      <w:r>
-        <w:t>Pointnet</w:t>
-      </w:r>
-      <w:proofErr w:type="spellEnd"/>
-      <w:r>
-        <w:t xml:space="preserve">++ and PVCNN </w:t>
+        <w:t xml:space="preserve">. So we want to stick with point clouds as well, as there is much groundwork that we can rely on from past works and point clouds represent a budget friendly way of modeling the surface of a 3d object. For latent diffusion the VAE is of great importance as it generates the latent codes to perform the diffusion on. For our work we would like to experiment with different VAEs. Pointnet++ and PVCNN </w:t>
       </w:r>
       <w:sdt>
         <w:sdtPr>
@@ -530,6 +535,7 @@
             <w:docPart w:val="974F459B38BE4EC4B15956B314CF5259"/>
           </w:placeholder>
         </w:sdtPr>
+        <w:sdtEndPr/>
         <w:sdtContent>
           <w:r>
             <w:fldChar w:fldCharType="begin"/>
@@ -549,15 +555,7 @@
         </w:sdtContent>
       </w:sdt>
       <w:r>
-        <w:t xml:space="preserve"> are popular and easy to use autoencoders that generate global shape </w:t>
-      </w:r>
-      <w:proofErr w:type="spellStart"/>
-      <w:r>
-        <w:t>latents</w:t>
-      </w:r>
-      <w:proofErr w:type="spellEnd"/>
-      <w:r>
-        <w:t xml:space="preserve">. LION </w:t>
+        <w:t xml:space="preserve"> are popular and easy to use autoencoders that generate global shape latents. LION </w:t>
       </w:r>
       <w:sdt>
         <w:sdtPr>
@@ -568,6 +566,7 @@
             <w:docPart w:val="974F459B38BE4EC4B15956B314CF5259"/>
           </w:placeholder>
         </w:sdtPr>
+        <w:sdtEndPr/>
         <w:sdtContent>
           <w:r>
             <w:fldChar w:fldCharType="begin"/>
@@ -587,7 +586,16 @@
         </w:sdtContent>
       </w:sdt>
       <w:r>
-        <w:t xml:space="preserve"> a more advanced architecture that suits or our needs perfectly constructs both a global shape latent and a point structure latent that better retains the geometrical structure of the original point cloud, thus providing the diffusion model with more geometric information. Then the diffusion model itself must be considered. Traditional latent diffusion models leverage a U-Net Design that relies on convolution layers </w:t>
+        <w:t xml:space="preserve"> </w:t>
+      </w:r>
+      <w:r>
+        <w:rPr>
+          <w:highlight w:val="yellow"/>
+        </w:rPr>
+        <w:t>a more advanced architecture that suits or our needs perfectly constructs both a global shape latent</w:t>
+      </w:r>
+      <w:r>
+        <w:t xml:space="preserve"> and a point structure latent that better retains the geometrical structure of the original point cloud, thus providing the diffusion model with more geometric information. Then the diffusion model itself must be considered. Traditional latent diffusion models leverage a U-Net Design that relies on convolution layers </w:t>
       </w:r>
       <w:sdt>
         <w:sdtPr>
@@ -598,6 +606,7 @@
             <w:docPart w:val="974F459B38BE4EC4B15956B314CF5259"/>
           </w:placeholder>
         </w:sdtPr>
+        <w:sdtEndPr/>
         <w:sdtContent>
           <w:r>
             <w:fldChar w:fldCharType="begin"/>
@@ -628,6 +637,7 @@
             <w:docPart w:val="974F459B38BE4EC4B15956B314CF5259"/>
           </w:placeholder>
         </w:sdtPr>
+        <w:sdtEndPr/>
         <w:sdtContent>
           <w:r>
             <w:fldChar w:fldCharType="begin"/>
@@ -647,13 +657,26 @@
         </w:sdtContent>
       </w:sdt>
       <w:r>
-        <w:t xml:space="preserve">. These works showed that transformers are very good in preserving the shape of the original object as the point cloud can be tokenized and enhanced with a positional encoding and fed to the transformer. Enhancing the input and feeding the model different input modalities like the joint angles, a point cloud of the robot hand or contact points between hand and object, will also be investigated. But for the start of the project, we will keep the model as simple as possible to have a solid baseline that can be improved upon. For the first two weeks we will explore the provided training data and try out VAEs with pretrained weights. Then we will a develop a simple architecture baseline of VAE that generates a global latent. Perform diffusion on the latent and let the model learn to denoise the latent. The feed the denoised latent to the decoder. So, the first baseline will be unconditional generation of shapes and two ease the problem </w:t>
+        <w:t xml:space="preserve">. These works showed that transformers are very good in preserving the shape of the original object as the point cloud can be tokenized and enhanced with a positional encoding and fed to the transformer. Enhancing the input and feeding the model different input modalities like the joint angles, a point cloud of the robot hand or contact points between hand and object, will also be investigated. But for the start of the project, we will keep the model as simple as possible to have a solid baseline that can be improved upon. For the first two weeks we will explore the provided training data and try out VAEs with pretrained weights. Then we will  develop a simple architecture baseline of VAE that generates a global latent. Perform diffusion on the latent and let the model learn to denoise the latent. </w:t>
+      </w:r>
+      <w:r>
+        <w:t>The</w:t>
+      </w:r>
+      <w:r>
+        <w:t>n we will</w:t>
+      </w:r>
+      <w:r>
+        <w:t xml:space="preserve"> feed the denoised latent to the decoder</w:t>
+      </w:r>
+      <w:r>
+        <w:t xml:space="preserve">. So, the first baseline will be unconditional generation of shapes and two ease the problem </w:t>
       </w:r>
       <w:r>
         <w:lastRenderedPageBreak/>
         <w:t xml:space="preserve">we could stick to only one object category at first, thus reducing the problem to a unimodal distribution, and try to overfit the model to a small dataset. If the model training loss improves and the model shows that it can overfit to a small easy dataset, we can iteratively increase the dataset size until we can be sure that the model can learn the distribution. If for instance, the model shows no convergence, then we can increase the model capacity or switch the architecture. If the model shows good convergence during training and </w:t>
       </w:r>
       <w:r>
+        <w:lastRenderedPageBreak/>
         <w:t xml:space="preserve">satisfying reconstruction quality we can add more features, for example grasp-conditional object reconstruction. We can try out different architectures with this approach compare them and when we finalized the architecture, we can experiment with more advanced techniques like cross-attention as a conditioning mechanism. Feeding the network different input modalities. Trying out implicit diffusion </w:t>
       </w:r>
       <w:sdt>
@@ -665,6 +688,7 @@
             <w:docPart w:val="974F459B38BE4EC4B15956B314CF5259"/>
           </w:placeholder>
         </w:sdtPr>
+        <w:sdtEndPr/>
         <w:sdtContent>
           <w:r>
             <w:fldChar w:fldCharType="begin"/>
@@ -724,17 +748,16 @@
     <w:p/>
     <w:sdt>
       <w:sdtPr>
+        <w:rPr>
+          <w:smallCaps w:val="0"/>
+        </w:rPr>
         <w:tag w:val="CitaviBibliography"/>
         <w:id w:val="1490745902"/>
         <w:placeholder>
           <w:docPart w:val="DefaultPlaceholder_-1854013440"/>
         </w:placeholder>
       </w:sdtPr>
-      <w:sdtEndPr>
-        <w:rPr>
-          <w:smallCaps w:val="0"/>
-        </w:rPr>
-      </w:sdtEndPr>
+      <w:sdtEndPr/>
       <w:sdtContent>
         <w:p>
           <w:pPr>
@@ -1139,7 +1162,7 @@
 </file>
 
 <file path=word/endnotes.xml><?xml version="1.0" encoding="utf-8"?>
-<w:endnotes xmlns:cx="http://schemas.microsoft.com/office/drawing/2014/chartex" xmlns:cx1="http://schemas.microsoft.com/office/drawing/2015/9/8/chartex" xmlns:cx2="http://schemas.microsoft.com/office/drawing/2015/10/21/chartex" xmlns:cx3="http://schemas.microsoft.com/office/drawing/2016/5/9/chartex" xmlns:cx4="http://schemas.microsoft.com/office/drawing/2016/5/10/chartex" xmlns:cx5="http://schemas.microsoft.com/office/drawing/2016/5/11/chartex" xmlns:cx6="http://schemas.microsoft.com/office/drawing/2016/5/12/chartex" xmlns:cx7="http://schemas.microsoft.com/office/drawing/2016/5/13/chartex" xmlns:cx8="http://schemas.microsoft.com/office/drawing/2016/5/14/chartex" xmlns:mc="http://schemas.openxmlformats.org/markup-compatibility/2006" xmlns:aink="http://schemas.microsoft.com/office/drawing/2016/ink" xmlns:am3d="http://schemas.microsoft.com/office/drawing/2017/model3d" xmlns:o="urn:schemas-microsoft-com:office:office" xmlns:oel="http://schemas.microsoft.com/office/2019/extlst" xmlns:r="http://purl.oclc.org/ooxml/officeDocument/relationships" xmlns:m="http://purl.oclc.org/ooxml/officeDocument/math" xmlns:v="urn:schemas-microsoft-com:vml" xmlns:wp14="http://schemas.microsoft.com/office/word/2010/wordprocessingDrawing" xmlns:wp="http://purl.oclc.org/ooxml/drawingml/wordprocessingDrawing" xmlns:w10="urn:schemas-microsoft-com:office:word" xmlns:w="http://purl.oclc.org/ooxml/wordprocessingml/main" xmlns:w14="http://schemas.microsoft.com/office/word/2010/wordml" xmlns:w15="http://schemas.microsoft.com/office/word/2012/wordml" xmlns:w16cex="http://schemas.microsoft.com/office/word/2018/wordml/cex" xmlns:w16cid="http://schemas.microsoft.com/office/word/2016/wordml/cid" xmlns:w16="http://schemas.microsoft.com/office/word/2018/wordml" xmlns:w16du="http://schemas.microsoft.com/office/word/2023/wordml/word16du" xmlns:w16sdtdh="http://schemas.microsoft.com/office/word/2020/wordml/sdtdatahash" xmlns:w16sdtfl="http://schemas.microsoft.com/office/word/2024/wordml/sdtformatlock" xmlns:w16se="http://schemas.microsoft.com/office/word/2015/wordml/symex" xmlns:wpi="http://schemas.microsoft.com/office/word/2010/wordprocessingInk" xmlns:wne="http://schemas.microsoft.com/office/word/2006/wordml" mc:Ignorable="w14 w15 w16se w16cid w16 w16cex w16sdtdh w16sdtfl w16du wne wp14">
+<w:endnotes xmlns:cx="http://schemas.microsoft.com/office/drawing/2014/chartex" xmlns:cx1="http://schemas.microsoft.com/office/drawing/2015/9/8/chartex" xmlns:mc="http://schemas.openxmlformats.org/markup-compatibility/2006" xmlns:o="urn:schemas-microsoft-com:office:office" xmlns:r="http://purl.oclc.org/ooxml/officeDocument/relationships" xmlns:m="http://purl.oclc.org/ooxml/officeDocument/math" xmlns:v="urn:schemas-microsoft-com:vml" xmlns:wp14="http://schemas.microsoft.com/office/word/2010/wordprocessingDrawing" xmlns:wp="http://purl.oclc.org/ooxml/drawingml/wordprocessingDrawing" xmlns:w10="urn:schemas-microsoft-com:office:word" xmlns:w="http://purl.oclc.org/ooxml/wordprocessingml/main" xmlns:w14="http://schemas.microsoft.com/office/word/2010/wordml" xmlns:w15="http://schemas.microsoft.com/office/word/2012/wordml" xmlns:w16se="http://schemas.microsoft.com/office/word/2015/wordml/symex" xmlns:wpi="http://schemas.microsoft.com/office/word/2010/wordprocessingInk" xmlns:wne="http://schemas.microsoft.com/office/word/2006/wordml" mc:Ignorable="w14 w15 w16se wne wp14">
   <w:endnote w:type="separator" w:id="-1">
     <w:p>
       <w:r>
@@ -1158,10 +1181,10 @@
 </file>
 
 <file path=word/footer1.xml><?xml version="1.0" encoding="utf-8"?>
-<w:ftr xmlns:cx="http://schemas.microsoft.com/office/drawing/2014/chartex" xmlns:cx1="http://schemas.microsoft.com/office/drawing/2015/9/8/chartex" xmlns:cx2="http://schemas.microsoft.com/office/drawing/2015/10/21/chartex" xmlns:cx3="http://schemas.microsoft.com/office/drawing/2016/5/9/chartex" xmlns:cx4="http://schemas.microsoft.com/office/drawing/2016/5/10/chartex" xmlns:cx5="http://schemas.microsoft.com/office/drawing/2016/5/11/chartex" xmlns:cx6="http://schemas.microsoft.com/office/drawing/2016/5/12/chartex" xmlns:cx7="http://schemas.microsoft.com/office/drawing/2016/5/13/chartex" xmlns:cx8="http://schemas.microsoft.com/office/drawing/2016/5/14/chartex" xmlns:mc="http://schemas.openxmlformats.org/markup-compatibility/2006" xmlns:aink="http://schemas.microsoft.com/office/drawing/2016/ink" xmlns:am3d="http://schemas.microsoft.com/office/drawing/2017/model3d" xmlns:o="urn:schemas-microsoft-com:office:office" xmlns:oel="http://schemas.microsoft.com/office/2019/extlst" xmlns:r="http://purl.oclc.org/ooxml/officeDocument/relationships" xmlns:m="http://purl.oclc.org/ooxml/officeDocument/math" xmlns:v="urn:schemas-microsoft-com:vml" xmlns:wp14="http://schemas.microsoft.com/office/word/2010/wordprocessingDrawing" xmlns:wp="http://purl.oclc.org/ooxml/drawingml/wordprocessingDrawing" xmlns:w10="urn:schemas-microsoft-com:office:word" xmlns:w="http://purl.oclc.org/ooxml/wordprocessingml/main" xmlns:w14="http://schemas.microsoft.com/office/word/2010/wordml" xmlns:w15="http://schemas.microsoft.com/office/word/2012/wordml" xmlns:w16cex="http://schemas.microsoft.com/office/word/2018/wordml/cex" xmlns:w16cid="http://schemas.microsoft.com/office/word/2016/wordml/cid" xmlns:w16="http://schemas.microsoft.com/office/word/2018/wordml" xmlns:w16du="http://schemas.microsoft.com/office/word/2023/wordml/word16du" xmlns:w16sdtdh="http://schemas.microsoft.com/office/word/2020/wordml/sdtdatahash" xmlns:w16sdtfl="http://schemas.microsoft.com/office/word/2024/wordml/sdtformatlock" xmlns:w16se="http://schemas.microsoft.com/office/word/2015/wordml/symex" xmlns:wpi="http://schemas.microsoft.com/office/word/2010/wordprocessingInk" xmlns:wne="http://schemas.microsoft.com/office/word/2006/wordml" mc:Ignorable="w14 w15 w16se w16cid w16 w16cex w16sdtdh w16sdtfl w16du wne wp14">
+<w:ftr xmlns:cx="http://schemas.microsoft.com/office/drawing/2014/chartex" xmlns:cx1="http://schemas.microsoft.com/office/drawing/2015/9/8/chartex" xmlns:mc="http://schemas.openxmlformats.org/markup-compatibility/2006" xmlns:o="urn:schemas-microsoft-com:office:office" xmlns:r="http://purl.oclc.org/ooxml/officeDocument/relationships" xmlns:m="http://purl.oclc.org/ooxml/officeDocument/math" xmlns:v="urn:schemas-microsoft-com:vml" xmlns:wp14="http://schemas.microsoft.com/office/word/2010/wordprocessingDrawing" xmlns:wp="http://purl.oclc.org/ooxml/drawingml/wordprocessingDrawing" xmlns:w10="urn:schemas-microsoft-com:office:word" xmlns:w="http://purl.oclc.org/ooxml/wordprocessingml/main" xmlns:w14="http://schemas.microsoft.com/office/word/2010/wordml" xmlns:w15="http://schemas.microsoft.com/office/word/2012/wordml" xmlns:w16se="http://schemas.microsoft.com/office/word/2015/wordml/symex" xmlns:wpi="http://schemas.microsoft.com/office/word/2010/wordprocessingInk" xmlns:wne="http://schemas.microsoft.com/office/word/2006/wordml" mc:Ignorable="w14 w15 w16se wne wp14">
   <w:p>
     <w:pPr>
-      <w:pStyle w:val="Fuzeile"/>
+      <w:pStyle w:val="Footer"/>
       <w:jc w:val="start"/>
       <w:rPr>
         <w:sz w:val="16"/>
@@ -1180,7 +1203,7 @@
 </file>
 
 <file path=word/footnotes.xml><?xml version="1.0" encoding="utf-8"?>
-<w:footnotes xmlns:cx="http://schemas.microsoft.com/office/drawing/2014/chartex" xmlns:cx1="http://schemas.microsoft.com/office/drawing/2015/9/8/chartex" xmlns:cx2="http://schemas.microsoft.com/office/drawing/2015/10/21/chartex" xmlns:cx3="http://schemas.microsoft.com/office/drawing/2016/5/9/chartex" xmlns:cx4="http://schemas.microsoft.com/office/drawing/2016/5/10/chartex" xmlns:cx5="http://schemas.microsoft.com/office/drawing/2016/5/11/chartex" xmlns:cx6="http://schemas.microsoft.com/office/drawing/2016/5/12/chartex" xmlns:cx7="http://schemas.microsoft.com/office/drawing/2016/5/13/chartex" xmlns:cx8="http://schemas.microsoft.com/office/drawing/2016/5/14/chartex" xmlns:mc="http://schemas.openxmlformats.org/markup-compatibility/2006" xmlns:aink="http://schemas.microsoft.com/office/drawing/2016/ink" xmlns:am3d="http://schemas.microsoft.com/office/drawing/2017/model3d" xmlns:o="urn:schemas-microsoft-com:office:office" xmlns:oel="http://schemas.microsoft.com/office/2019/extlst" xmlns:r="http://purl.oclc.org/ooxml/officeDocument/relationships" xmlns:m="http://purl.oclc.org/ooxml/officeDocument/math" xmlns:v="urn:schemas-microsoft-com:vml" xmlns:wp14="http://schemas.microsoft.com/office/word/2010/wordprocessingDrawing" xmlns:wp="http://purl.oclc.org/ooxml/drawingml/wordprocessingDrawing" xmlns:w10="urn:schemas-microsoft-com:office:word" xmlns:w="http://purl.oclc.org/ooxml/wordprocessingml/main" xmlns:w14="http://schemas.microsoft.com/office/word/2010/wordml" xmlns:w15="http://schemas.microsoft.com/office/word/2012/wordml" xmlns:w16cex="http://schemas.microsoft.com/office/word/2018/wordml/cex" xmlns:w16cid="http://schemas.microsoft.com/office/word/2016/wordml/cid" xmlns:w16="http://schemas.microsoft.com/office/word/2018/wordml" xmlns:w16du="http://schemas.microsoft.com/office/word/2023/wordml/word16du" xmlns:w16sdtdh="http://schemas.microsoft.com/office/word/2020/wordml/sdtdatahash" xmlns:w16sdtfl="http://schemas.microsoft.com/office/word/2024/wordml/sdtformatlock" xmlns:w16se="http://schemas.microsoft.com/office/word/2015/wordml/symex" xmlns:wpi="http://schemas.microsoft.com/office/word/2010/wordprocessingInk" xmlns:wne="http://schemas.microsoft.com/office/word/2006/wordml" mc:Ignorable="w14 w15 w16se w16cid w16 w16cex w16sdtdh w16sdtfl w16du wne wp14">
+<w:footnotes xmlns:cx="http://schemas.microsoft.com/office/drawing/2014/chartex" xmlns:cx1="http://schemas.microsoft.com/office/drawing/2015/9/8/chartex" xmlns:mc="http://schemas.openxmlformats.org/markup-compatibility/2006" xmlns:o="urn:schemas-microsoft-com:office:office" xmlns:r="http://purl.oclc.org/ooxml/officeDocument/relationships" xmlns:m="http://purl.oclc.org/ooxml/officeDocument/math" xmlns:v="urn:schemas-microsoft-com:vml" xmlns:wp14="http://schemas.microsoft.com/office/word/2010/wordprocessingDrawing" xmlns:wp="http://purl.oclc.org/ooxml/drawingml/wordprocessingDrawing" xmlns:w10="urn:schemas-microsoft-com:office:word" xmlns:w="http://purl.oclc.org/ooxml/wordprocessingml/main" xmlns:w14="http://schemas.microsoft.com/office/word/2010/wordml" xmlns:w15="http://schemas.microsoft.com/office/word/2012/wordml" xmlns:w16se="http://schemas.microsoft.com/office/word/2015/wordml/symex" xmlns:wpi="http://schemas.microsoft.com/office/word/2010/wordprocessingInk" xmlns:wne="http://schemas.microsoft.com/office/word/2006/wordml" mc:Ignorable="w14 w15 w16se wne wp14">
   <w:footnote w:type="separator" w:id="-1">
     <w:p>
       <w:r>
@@ -1199,7 +1222,7 @@
 </file>
 
 <file path=word/numbering.xml><?xml version="1.0" encoding="utf-8"?>
-<w:numbering xmlns:cx="http://schemas.microsoft.com/office/drawing/2014/chartex" xmlns:cx1="http://schemas.microsoft.com/office/drawing/2015/9/8/chartex" xmlns:cx2="http://schemas.microsoft.com/office/drawing/2015/10/21/chartex" xmlns:cx3="http://schemas.microsoft.com/office/drawing/2016/5/9/chartex" xmlns:cx4="http://schemas.microsoft.com/office/drawing/2016/5/10/chartex" xmlns:cx5="http://schemas.microsoft.com/office/drawing/2016/5/11/chartex" xmlns:cx6="http://schemas.microsoft.com/office/drawing/2016/5/12/chartex" xmlns:cx7="http://schemas.microsoft.com/office/drawing/2016/5/13/chartex" xmlns:cx8="http://schemas.microsoft.com/office/drawing/2016/5/14/chartex" xmlns:mc="http://schemas.openxmlformats.org/markup-compatibility/2006" xmlns:aink="http://schemas.microsoft.com/office/drawing/2016/ink" xmlns:am3d="http://schemas.microsoft.com/office/drawing/2017/model3d" xmlns:o="urn:schemas-microsoft-com:office:office" xmlns:oel="http://schemas.microsoft.com/office/2019/extlst" xmlns:r="http://purl.oclc.org/ooxml/officeDocument/relationships" xmlns:m="http://purl.oclc.org/ooxml/officeDocument/math" xmlns:v="urn:schemas-microsoft-com:vml" xmlns:wp14="http://schemas.microsoft.com/office/word/2010/wordprocessingDrawing" xmlns:wp="http://purl.oclc.org/ooxml/drawingml/wordprocessingDrawing" xmlns:w10="urn:schemas-microsoft-com:office:word" xmlns:w="http://purl.oclc.org/ooxml/wordprocessingml/main" xmlns:w14="http://schemas.microsoft.com/office/word/2010/wordml" xmlns:w15="http://schemas.microsoft.com/office/word/2012/wordml" xmlns:w16cex="http://schemas.microsoft.com/office/word/2018/wordml/cex" xmlns:w16cid="http://schemas.microsoft.com/office/word/2016/wordml/cid" xmlns:w16="http://schemas.microsoft.com/office/word/2018/wordml" xmlns:w16du="http://schemas.microsoft.com/office/word/2023/wordml/word16du" xmlns:w16sdtdh="http://schemas.microsoft.com/office/word/2020/wordml/sdtdatahash" xmlns:w16sdtfl="http://schemas.microsoft.com/office/word/2024/wordml/sdtformatlock" xmlns:w16se="http://schemas.microsoft.com/office/word/2015/wordml/symex" xmlns:wpi="http://schemas.microsoft.com/office/word/2010/wordprocessingInk" xmlns:wne="http://schemas.microsoft.com/office/word/2006/wordml" mc:Ignorable="w14 w15 w16se w16cid w16 w16cex w16sdtdh w16sdtfl w16du wne wp14">
+<w:numbering xmlns:cx="http://schemas.microsoft.com/office/drawing/2014/chartex" xmlns:cx1="http://schemas.microsoft.com/office/drawing/2015/9/8/chartex" xmlns:mc="http://schemas.openxmlformats.org/markup-compatibility/2006" xmlns:o="urn:schemas-microsoft-com:office:office" xmlns:r="http://purl.oclc.org/ooxml/officeDocument/relationships" xmlns:m="http://purl.oclc.org/ooxml/officeDocument/math" xmlns:v="urn:schemas-microsoft-com:vml" xmlns:wp14="http://schemas.microsoft.com/office/word/2010/wordprocessingDrawing" xmlns:wp="http://purl.oclc.org/ooxml/drawingml/wordprocessingDrawing" xmlns:w10="urn:schemas-microsoft-com:office:word" xmlns:w="http://purl.oclc.org/ooxml/wordprocessingml/main" xmlns:w14="http://schemas.microsoft.com/office/word/2010/wordml" xmlns:w15="http://schemas.microsoft.com/office/word/2012/wordml" xmlns:w16se="http://schemas.microsoft.com/office/word/2015/wordml/symex" xmlns:wpi="http://schemas.microsoft.com/office/word/2010/wordprocessingInk" xmlns:wne="http://schemas.microsoft.com/office/word/2006/wordml" mc:Ignorable="w14 w15 w16se wne wp14">
   <w:abstractNum w:abstractNumId="0" w15:restartNumberingAfterBreak="0">
     <w:nsid w:val="FFFFFF1D"/>
     <w:multiLevelType w:val="multilevel"/>
@@ -2082,7 +2105,7 @@
     <w:lvl w:ilvl="0">
       <w:start w:val="1"/>
       <w:numFmt w:val="upperRoman"/>
-      <w:pStyle w:val="berschrift1"/>
+      <w:pStyle w:val="Heading1"/>
       <w:lvlText w:val="%1."/>
       <w:lvlJc w:val="center"/>
       <w:pPr>
@@ -2114,7 +2137,7 @@
     <w:lvl w:ilvl="1">
       <w:start w:val="1"/>
       <w:numFmt w:val="upperLetter"/>
-      <w:pStyle w:val="berschrift2"/>
+      <w:pStyle w:val="Heading2"/>
       <w:lvlText w:val="%2."/>
       <w:lvlJc w:val="start"/>
       <w:pPr>
@@ -2150,7 +2173,7 @@
     <w:lvl w:ilvl="2">
       <w:start w:val="1"/>
       <w:numFmt w:val="decimal"/>
-      <w:pStyle w:val="berschrift3"/>
+      <w:pStyle w:val="Heading3"/>
       <w:lvlText w:val="%3)"/>
       <w:lvlJc w:val="start"/>
       <w:pPr>
@@ -2186,7 +2209,7 @@
     <w:lvl w:ilvl="3">
       <w:start w:val="1"/>
       <w:numFmt w:val="lowerLetter"/>
-      <w:pStyle w:val="berschrift4"/>
+      <w:pStyle w:val="Heading4"/>
       <w:lvlText w:val="%4)"/>
       <w:lvlJc w:val="start"/>
       <w:pPr>
@@ -2591,83 +2614,83 @@
       </w:rPr>
     </w:lvl>
   </w:abstractNum>
-  <w:num w:numId="1" w16cid:durableId="1369909383">
+  <w:num w:numId="1">
     <w:abstractNumId w:val="14"/>
   </w:num>
-  <w:num w:numId="2" w16cid:durableId="568543031">
+  <w:num w:numId="2">
     <w:abstractNumId w:val="19"/>
   </w:num>
-  <w:num w:numId="3" w16cid:durableId="1207790780">
+  <w:num w:numId="3">
     <w:abstractNumId w:val="13"/>
   </w:num>
-  <w:num w:numId="4" w16cid:durableId="629168631">
+  <w:num w:numId="4">
     <w:abstractNumId w:val="16"/>
   </w:num>
-  <w:num w:numId="5" w16cid:durableId="1032806882">
+  <w:num w:numId="5">
     <w:abstractNumId w:val="16"/>
   </w:num>
-  <w:num w:numId="6" w16cid:durableId="1614826021">
+  <w:num w:numId="6">
     <w:abstractNumId w:val="16"/>
   </w:num>
-  <w:num w:numId="7" w16cid:durableId="1871990542">
+  <w:num w:numId="7">
     <w:abstractNumId w:val="16"/>
   </w:num>
-  <w:num w:numId="8" w16cid:durableId="2088458160">
+  <w:num w:numId="8">
     <w:abstractNumId w:val="18"/>
   </w:num>
-  <w:num w:numId="9" w16cid:durableId="231694775">
+  <w:num w:numId="9">
     <w:abstractNumId w:val="20"/>
   </w:num>
-  <w:num w:numId="10" w16cid:durableId="2126189682">
+  <w:num w:numId="10">
     <w:abstractNumId w:val="15"/>
   </w:num>
-  <w:num w:numId="11" w16cid:durableId="771515552">
+  <w:num w:numId="11">
     <w:abstractNumId w:val="12"/>
   </w:num>
-  <w:num w:numId="12" w16cid:durableId="1603688421">
+  <w:num w:numId="12">
     <w:abstractNumId w:val="11"/>
   </w:num>
-  <w:num w:numId="13" w16cid:durableId="308025467">
+  <w:num w:numId="13">
     <w:abstractNumId w:val="0"/>
   </w:num>
-  <w:num w:numId="14" w16cid:durableId="915015855">
+  <w:num w:numId="14">
     <w:abstractNumId w:val="10"/>
   </w:num>
-  <w:num w:numId="15" w16cid:durableId="124853704">
+  <w:num w:numId="15">
     <w:abstractNumId w:val="8"/>
   </w:num>
-  <w:num w:numId="16" w16cid:durableId="378433823">
+  <w:num w:numId="16">
     <w:abstractNumId w:val="7"/>
   </w:num>
-  <w:num w:numId="17" w16cid:durableId="178550123">
+  <w:num w:numId="17">
     <w:abstractNumId w:val="6"/>
   </w:num>
-  <w:num w:numId="18" w16cid:durableId="1882938436">
+  <w:num w:numId="18">
     <w:abstractNumId w:val="5"/>
   </w:num>
-  <w:num w:numId="19" w16cid:durableId="1292051459">
+  <w:num w:numId="19">
     <w:abstractNumId w:val="9"/>
   </w:num>
-  <w:num w:numId="20" w16cid:durableId="439644133">
+  <w:num w:numId="20">
     <w:abstractNumId w:val="4"/>
   </w:num>
-  <w:num w:numId="21" w16cid:durableId="277882354">
+  <w:num w:numId="21">
     <w:abstractNumId w:val="3"/>
   </w:num>
-  <w:num w:numId="22" w16cid:durableId="85808594">
+  <w:num w:numId="22">
     <w:abstractNumId w:val="2"/>
   </w:num>
-  <w:num w:numId="23" w16cid:durableId="306714086">
+  <w:num w:numId="23">
     <w:abstractNumId w:val="1"/>
   </w:num>
-  <w:num w:numId="24" w16cid:durableId="276639338">
+  <w:num w:numId="24">
     <w:abstractNumId w:val="17"/>
   </w:num>
 </w:numbering>
 </file>
 
 <file path=word/styles.xml><?xml version="1.0" encoding="utf-8"?>
-<w:styles xmlns:mc="http://schemas.openxmlformats.org/markup-compatibility/2006" xmlns:r="http://purl.oclc.org/ooxml/officeDocument/relationships" xmlns:w="http://purl.oclc.org/ooxml/wordprocessingml/main" xmlns:w14="http://schemas.microsoft.com/office/word/2010/wordml" xmlns:w15="http://schemas.microsoft.com/office/word/2012/wordml" xmlns:w16cex="http://schemas.microsoft.com/office/word/2018/wordml/cex" xmlns:w16cid="http://schemas.microsoft.com/office/word/2016/wordml/cid" xmlns:w16="http://schemas.microsoft.com/office/word/2018/wordml" xmlns:w16du="http://schemas.microsoft.com/office/word/2023/wordml/word16du" xmlns:w16sdtdh="http://schemas.microsoft.com/office/word/2020/wordml/sdtdatahash" xmlns:w16sdtfl="http://schemas.microsoft.com/office/word/2024/wordml/sdtformatlock" xmlns:w16se="http://schemas.microsoft.com/office/word/2015/wordml/symex" mc:Ignorable="w14 w15 w16se w16cid w16 w16cex w16sdtdh w16sdtfl w16du">
+<w:styles xmlns:mc="http://schemas.openxmlformats.org/markup-compatibility/2006" xmlns:r="http://purl.oclc.org/ooxml/officeDocument/relationships" xmlns:w="http://purl.oclc.org/ooxml/wordprocessingml/main" xmlns:w14="http://schemas.microsoft.com/office/word/2010/wordml" xmlns:w15="http://schemas.microsoft.com/office/word/2012/wordml" xmlns:w16se="http://schemas.microsoft.com/office/word/2015/wordml/symex" mc:Ignorable="w14 w15 w16se">
   <w:docDefaults>
     <w:rPrDefault>
       <w:rPr>
@@ -2677,7 +2700,7 @@
     </w:rPrDefault>
     <w:pPrDefault/>
   </w:docDefaults>
-  <w:latentStyles w:defLockedState="0" w:defUIPriority="0" w:defSemiHidden="0" w:defUnhideWhenUsed="0" w:defQFormat="0" w:count="376">
+  <w:latentStyles w:defLockedState="0" w:defUIPriority="0" w:defSemiHidden="0" w:defUnhideWhenUsed="0" w:defQFormat="0" w:count="371">
     <w:lsdException w:name="Normal" w:qFormat="1"/>
     <w:lsdException w:name="heading 1" w:qFormat="1"/>
     <w:lsdException w:name="heading 2" w:qFormat="1"/>
@@ -2952,24 +2975,19 @@
     <w:lsdException w:name="List Table 5 Dark Accent 6" w:uiPriority="50"/>
     <w:lsdException w:name="List Table 6 Colorful Accent 6" w:uiPriority="51"/>
     <w:lsdException w:name="List Table 7 Colorful Accent 6" w:uiPriority="52"/>
-    <w:lsdException w:name="Mention" w:semiHidden="1" w:uiPriority="99" w:unhideWhenUsed="1"/>
-    <w:lsdException w:name="Smart Hyperlink" w:semiHidden="1" w:uiPriority="99" w:unhideWhenUsed="1"/>
-    <w:lsdException w:name="Hashtag" w:semiHidden="1" w:uiPriority="99" w:unhideWhenUsed="1"/>
-    <w:lsdException w:name="Unresolved Mention" w:semiHidden="1" w:uiPriority="99" w:unhideWhenUsed="1"/>
-    <w:lsdException w:name="Smart Link" w:semiHidden="1" w:uiPriority="99" w:unhideWhenUsed="1"/>
   </w:latentStyles>
-  <w:style w:type="paragraph" w:default="1" w:styleId="Standard">
+  <w:style w:type="paragraph" w:default="1" w:styleId="Normal">
     <w:name w:val="Normal"/>
     <w:qFormat/>
     <w:pPr>
       <w:jc w:val="center"/>
     </w:pPr>
   </w:style>
-  <w:style w:type="paragraph" w:styleId="berschrift1">
+  <w:style w:type="paragraph" w:styleId="Heading1">
     <w:name w:val="heading 1"/>
-    <w:basedOn w:val="Standard"/>
-    <w:next w:val="Standard"/>
-    <w:link w:val="berschrift1Zchn"/>
+    <w:basedOn w:val="Normal"/>
+    <w:next w:val="Normal"/>
+    <w:link w:val="Heading1Char"/>
     <w:qFormat/>
     <w:rsid w:val="006B6B66"/>
     <w:pPr>
@@ -2990,10 +3008,10 @@
       <w:noProof/>
     </w:rPr>
   </w:style>
-  <w:style w:type="paragraph" w:styleId="berschrift2">
+  <w:style w:type="paragraph" w:styleId="Heading2">
     <w:name w:val="heading 2"/>
-    <w:basedOn w:val="Standard"/>
-    <w:next w:val="Standard"/>
+    <w:basedOn w:val="Normal"/>
+    <w:next w:val="Normal"/>
     <w:qFormat/>
     <w:rsid w:val="00ED0149"/>
     <w:pPr>
@@ -3017,10 +3035,10 @@
       <w:noProof/>
     </w:rPr>
   </w:style>
-  <w:style w:type="paragraph" w:styleId="berschrift3">
+  <w:style w:type="paragraph" w:styleId="Heading3">
     <w:name w:val="heading 3"/>
-    <w:basedOn w:val="Standard"/>
-    <w:next w:val="Standard"/>
+    <w:basedOn w:val="Normal"/>
+    <w:next w:val="Normal"/>
     <w:qFormat/>
     <w:rsid w:val="00794804"/>
     <w:pPr>
@@ -3039,10 +3057,10 @@
       <w:noProof/>
     </w:rPr>
   </w:style>
-  <w:style w:type="paragraph" w:styleId="berschrift4">
+  <w:style w:type="paragraph" w:styleId="Heading4">
     <w:name w:val="heading 4"/>
-    <w:basedOn w:val="Standard"/>
-    <w:next w:val="Standard"/>
+    <w:basedOn w:val="Normal"/>
+    <w:next w:val="Normal"/>
     <w:qFormat/>
     <w:rsid w:val="00794804"/>
     <w:pPr>
@@ -3065,10 +3083,10 @@
       <w:noProof/>
     </w:rPr>
   </w:style>
-  <w:style w:type="paragraph" w:styleId="berschrift5">
+  <w:style w:type="paragraph" w:styleId="Heading5">
     <w:name w:val="heading 5"/>
-    <w:basedOn w:val="Standard"/>
-    <w:next w:val="Standard"/>
+    <w:basedOn w:val="Normal"/>
+    <w:next w:val="Normal"/>
     <w:qFormat/>
     <w:pPr>
       <w:tabs>
@@ -3082,11 +3100,11 @@
       <w:noProof/>
     </w:rPr>
   </w:style>
-  <w:style w:type="paragraph" w:styleId="berschrift6">
+  <w:style w:type="paragraph" w:styleId="Heading6">
     <w:name w:val="heading 6"/>
-    <w:basedOn w:val="Standard"/>
-    <w:next w:val="Standard"/>
-    <w:link w:val="berschrift6Zchn"/>
+    <w:basedOn w:val="Normal"/>
+    <w:next w:val="Normal"/>
+    <w:link w:val="Heading6Char"/>
     <w:semiHidden/>
     <w:unhideWhenUsed/>
     <w:qFormat/>
@@ -3102,11 +3120,11 @@
       <w:color w:val="1F4D78" w:themeColor="accent1" w:themeShade="7F"/>
     </w:rPr>
   </w:style>
-  <w:style w:type="paragraph" w:styleId="berschrift7">
+  <w:style w:type="paragraph" w:styleId="Heading7">
     <w:name w:val="heading 7"/>
-    <w:basedOn w:val="Standard"/>
-    <w:next w:val="Standard"/>
-    <w:link w:val="berschrift7Zchn"/>
+    <w:basedOn w:val="Normal"/>
+    <w:next w:val="Normal"/>
+    <w:link w:val="Heading7Char"/>
     <w:semiHidden/>
     <w:unhideWhenUsed/>
     <w:qFormat/>
@@ -3124,11 +3142,11 @@
       <w:color w:val="1F4D78" w:themeColor="accent1" w:themeShade="7F"/>
     </w:rPr>
   </w:style>
-  <w:style w:type="paragraph" w:styleId="berschrift8">
+  <w:style w:type="paragraph" w:styleId="Heading8">
     <w:name w:val="heading 8"/>
-    <w:basedOn w:val="Standard"/>
-    <w:next w:val="Standard"/>
-    <w:link w:val="berschrift8Zchn"/>
+    <w:basedOn w:val="Normal"/>
+    <w:next w:val="Normal"/>
+    <w:link w:val="Heading8Char"/>
     <w:semiHidden/>
     <w:unhideWhenUsed/>
     <w:qFormat/>
@@ -3146,11 +3164,11 @@
       <w:szCs w:val="21"/>
     </w:rPr>
   </w:style>
-  <w:style w:type="paragraph" w:styleId="berschrift9">
+  <w:style w:type="paragraph" w:styleId="Heading9">
     <w:name w:val="heading 9"/>
-    <w:basedOn w:val="Standard"/>
-    <w:next w:val="Standard"/>
-    <w:link w:val="berschrift9Zchn"/>
+    <w:basedOn w:val="Normal"/>
+    <w:next w:val="Normal"/>
+    <w:link w:val="Heading9Char"/>
     <w:semiHidden/>
     <w:unhideWhenUsed/>
     <w:qFormat/>
@@ -3170,12 +3188,13 @@
       <w:szCs w:val="21"/>
     </w:rPr>
   </w:style>
-  <w:style w:type="character" w:default="1" w:styleId="Absatz-Standardschriftart">
+  <w:style w:type="character" w:default="1" w:styleId="DefaultParagraphFont">
     <w:name w:val="Default Paragraph Font"/>
     <w:uiPriority w:val="1"/>
+    <w:semiHidden/>
     <w:unhideWhenUsed/>
   </w:style>
-  <w:style w:type="table" w:default="1" w:styleId="NormaleTabelle">
+  <w:style w:type="table" w:default="1" w:styleId="TableNormal">
     <w:name w:val="Normal Table"/>
     <w:uiPriority w:val="99"/>
     <w:semiHidden/>
@@ -3190,7 +3209,7 @@
       </w:tblCellMar>
     </w:tblPr>
   </w:style>
-  <w:style w:type="numbering" w:default="1" w:styleId="KeineListe">
+  <w:style w:type="numbering" w:default="1" w:styleId="NoList">
     <w:name w:val="No List"/>
     <w:uiPriority w:val="99"/>
     <w:semiHidden/>
@@ -3229,10 +3248,10 @@
       <w:szCs w:val="22"/>
     </w:rPr>
   </w:style>
-  <w:style w:type="paragraph" w:styleId="Textkrper">
+  <w:style w:type="paragraph" w:styleId="BodyText">
     <w:name w:val="Body Text"/>
-    <w:basedOn w:val="Standard"/>
-    <w:link w:val="TextkrperZchn"/>
+    <w:basedOn w:val="Normal"/>
+    <w:link w:val="BodyTextChar"/>
     <w:rsid w:val="00E7596C"/>
     <w:pPr>
       <w:tabs>
@@ -3247,9 +3266,9 @@
       <w:lang w:val="x-none" w:eastAsia="x-none"/>
     </w:rPr>
   </w:style>
-  <w:style w:type="character" w:customStyle="1" w:styleId="TextkrperZchn">
-    <w:name w:val="Textkörper Zchn"/>
-    <w:link w:val="Textkrper"/>
+  <w:style w:type="character" w:customStyle="1" w:styleId="BodyTextChar">
+    <w:name w:val="Body Text Char"/>
+    <w:link w:val="BodyText"/>
     <w:rsid w:val="00E7596C"/>
     <w:rPr>
       <w:spacing w:val="-1"/>
@@ -3258,7 +3277,7 @@
   </w:style>
   <w:style w:type="paragraph" w:customStyle="1" w:styleId="bulletlist">
     <w:name w:val="bullet list"/>
-    <w:basedOn w:val="Textkrper"/>
+    <w:basedOn w:val="BodyText"/>
     <w:rsid w:val="001B67DC"/>
     <w:pPr>
       <w:numPr>
@@ -3272,7 +3291,7 @@
   </w:style>
   <w:style w:type="paragraph" w:customStyle="1" w:styleId="equation">
     <w:name w:val="equation"/>
-    <w:basedOn w:val="Standard"/>
+    <w:basedOn w:val="Normal"/>
     <w:rsid w:val="008A2C7D"/>
     <w:pPr>
       <w:tabs>
@@ -3377,7 +3396,7 @@
   </w:style>
   <w:style w:type="paragraph" w:customStyle="1" w:styleId="tablecolhead">
     <w:name w:val="table col head"/>
-    <w:basedOn w:val="Standard"/>
+    <w:basedOn w:val="Normal"/>
     <w:rPr>
       <w:b/>
       <w:bCs/>
@@ -3451,10 +3470,10 @@
       <w:i/>
     </w:rPr>
   </w:style>
-  <w:style w:type="paragraph" w:styleId="Kopfzeile">
+  <w:style w:type="paragraph" w:styleId="Header">
     <w:name w:val="header"/>
-    <w:basedOn w:val="Standard"/>
-    <w:link w:val="KopfzeileZchn"/>
+    <w:basedOn w:val="Normal"/>
+    <w:link w:val="HeaderChar"/>
     <w:rsid w:val="001A3B3D"/>
     <w:pPr>
       <w:tabs>
@@ -3463,16 +3482,16 @@
       </w:tabs>
     </w:pPr>
   </w:style>
-  <w:style w:type="character" w:customStyle="1" w:styleId="KopfzeileZchn">
-    <w:name w:val="Kopfzeile Zchn"/>
-    <w:basedOn w:val="Absatz-Standardschriftart"/>
-    <w:link w:val="Kopfzeile"/>
+  <w:style w:type="character" w:customStyle="1" w:styleId="HeaderChar">
+    <w:name w:val="Header Char"/>
+    <w:basedOn w:val="DefaultParagraphFont"/>
+    <w:link w:val="Header"/>
     <w:rsid w:val="001A3B3D"/>
   </w:style>
-  <w:style w:type="paragraph" w:styleId="Fuzeile">
+  <w:style w:type="paragraph" w:styleId="Footer">
     <w:name w:val="footer"/>
-    <w:basedOn w:val="Standard"/>
-    <w:link w:val="FuzeileZchn"/>
+    <w:basedOn w:val="Normal"/>
+    <w:link w:val="FooterChar"/>
     <w:rsid w:val="001A3B3D"/>
     <w:pPr>
       <w:tabs>
@@ -3481,15 +3500,15 @@
       </w:tabs>
     </w:pPr>
   </w:style>
-  <w:style w:type="character" w:customStyle="1" w:styleId="FuzeileZchn">
-    <w:name w:val="Fußzeile Zchn"/>
-    <w:basedOn w:val="Absatz-Standardschriftart"/>
-    <w:link w:val="Fuzeile"/>
+  <w:style w:type="character" w:customStyle="1" w:styleId="FooterChar">
+    <w:name w:val="Footer Char"/>
+    <w:basedOn w:val="DefaultParagraphFont"/>
+    <w:link w:val="Footer"/>
     <w:rsid w:val="001A3B3D"/>
   </w:style>
   <w:style w:type="paragraph" w:customStyle="1" w:styleId="CitaviBibliographyEntry">
     <w:name w:val="Citavi Bibliography Entry"/>
-    <w:basedOn w:val="Standard"/>
+    <w:basedOn w:val="Normal"/>
     <w:link w:val="CitaviBibliographyEntryZchn"/>
     <w:uiPriority w:val="99"/>
     <w:rsid w:val="000700DB"/>
@@ -3504,10 +3523,10 @@
       <w:noProof/>
     </w:rPr>
   </w:style>
-  <w:style w:type="character" w:customStyle="1" w:styleId="berschrift1Zchn">
-    <w:name w:val="Überschrift 1 Zchn"/>
-    <w:basedOn w:val="Absatz-Standardschriftart"/>
-    <w:link w:val="berschrift1"/>
+  <w:style w:type="character" w:customStyle="1" w:styleId="Heading1Char">
+    <w:name w:val="Heading 1 Char"/>
+    <w:basedOn w:val="DefaultParagraphFont"/>
+    <w:link w:val="Heading1"/>
     <w:rsid w:val="000700DB"/>
     <w:rPr>
       <w:smallCaps/>
@@ -3516,7 +3535,7 @@
   </w:style>
   <w:style w:type="character" w:customStyle="1" w:styleId="CitaviBibliographyEntryZchn">
     <w:name w:val="Citavi Bibliography Entry Zchn"/>
-    <w:basedOn w:val="berschrift1Zchn"/>
+    <w:basedOn w:val="Heading1Char"/>
     <w:link w:val="CitaviBibliographyEntry"/>
     <w:uiPriority w:val="99"/>
     <w:rsid w:val="000700DB"/>
@@ -3527,7 +3546,7 @@
   </w:style>
   <w:style w:type="paragraph" w:customStyle="1" w:styleId="CitaviBibliographyHeading">
     <w:name w:val="Citavi Bibliography Heading"/>
-    <w:basedOn w:val="berschrift1"/>
+    <w:basedOn w:val="Heading1"/>
     <w:link w:val="CitaviBibliographyHeadingZchn"/>
     <w:uiPriority w:val="99"/>
     <w:rsid w:val="000700DB"/>
@@ -3537,7 +3556,7 @@
   </w:style>
   <w:style w:type="character" w:customStyle="1" w:styleId="CitaviBibliographyHeadingZchn">
     <w:name w:val="Citavi Bibliography Heading Zchn"/>
-    <w:basedOn w:val="berschrift1Zchn"/>
+    <w:basedOn w:val="Heading1Char"/>
     <w:link w:val="CitaviBibliographyHeading"/>
     <w:uiPriority w:val="99"/>
     <w:rsid w:val="000700DB"/>
@@ -3548,14 +3567,14 @@
   </w:style>
   <w:style w:type="paragraph" w:customStyle="1" w:styleId="CitaviChapterBibliographyHeading">
     <w:name w:val="Citavi Chapter Bibliography Heading"/>
-    <w:basedOn w:val="berschrift2"/>
+    <w:basedOn w:val="Heading2"/>
     <w:link w:val="CitaviChapterBibliographyHeadingZchn"/>
     <w:uiPriority w:val="99"/>
     <w:rsid w:val="000700DB"/>
   </w:style>
   <w:style w:type="character" w:customStyle="1" w:styleId="CitaviChapterBibliographyHeadingZchn">
     <w:name w:val="Citavi Chapter Bibliography Heading Zchn"/>
-    <w:basedOn w:val="berschrift1Zchn"/>
+    <w:basedOn w:val="Heading1Char"/>
     <w:link w:val="CitaviChapterBibliographyHeading"/>
     <w:uiPriority w:val="99"/>
     <w:rsid w:val="000700DB"/>
@@ -3568,7 +3587,7 @@
   </w:style>
   <w:style w:type="paragraph" w:customStyle="1" w:styleId="CitaviBibliographySubheading1">
     <w:name w:val="Citavi Bibliography Subheading 1"/>
-    <w:basedOn w:val="berschrift2"/>
+    <w:basedOn w:val="Heading2"/>
     <w:link w:val="CitaviBibliographySubheading1Zchn"/>
     <w:uiPriority w:val="99"/>
     <w:rsid w:val="000700DB"/>
@@ -3578,7 +3597,7 @@
   </w:style>
   <w:style w:type="character" w:customStyle="1" w:styleId="CitaviBibliographySubheading1Zchn">
     <w:name w:val="Citavi Bibliography Subheading 1 Zchn"/>
-    <w:basedOn w:val="berschrift1Zchn"/>
+    <w:basedOn w:val="Heading1Char"/>
     <w:link w:val="CitaviBibliographySubheading1"/>
     <w:uiPriority w:val="99"/>
     <w:rsid w:val="000700DB"/>
@@ -3591,7 +3610,7 @@
   </w:style>
   <w:style w:type="paragraph" w:customStyle="1" w:styleId="CitaviBibliographySubheading2">
     <w:name w:val="Citavi Bibliography Subheading 2"/>
-    <w:basedOn w:val="berschrift3"/>
+    <w:basedOn w:val="Heading3"/>
     <w:link w:val="CitaviBibliographySubheading2Zchn"/>
     <w:uiPriority w:val="99"/>
     <w:rsid w:val="000700DB"/>
@@ -3601,7 +3620,7 @@
   </w:style>
   <w:style w:type="character" w:customStyle="1" w:styleId="CitaviBibliographySubheading2Zchn">
     <w:name w:val="Citavi Bibliography Subheading 2 Zchn"/>
-    <w:basedOn w:val="berschrift1Zchn"/>
+    <w:basedOn w:val="Heading1Char"/>
     <w:link w:val="CitaviBibliographySubheading2"/>
     <w:uiPriority w:val="99"/>
     <w:rsid w:val="000700DB"/>
@@ -3614,7 +3633,7 @@
   </w:style>
   <w:style w:type="paragraph" w:customStyle="1" w:styleId="CitaviBibliographySubheading3">
     <w:name w:val="Citavi Bibliography Subheading 3"/>
-    <w:basedOn w:val="berschrift4"/>
+    <w:basedOn w:val="Heading4"/>
     <w:link w:val="CitaviBibliographySubheading3Zchn"/>
     <w:uiPriority w:val="99"/>
     <w:rsid w:val="000700DB"/>
@@ -3624,7 +3643,7 @@
   </w:style>
   <w:style w:type="character" w:customStyle="1" w:styleId="CitaviBibliographySubheading3Zchn">
     <w:name w:val="Citavi Bibliography Subheading 3 Zchn"/>
-    <w:basedOn w:val="berschrift1Zchn"/>
+    <w:basedOn w:val="Heading1Char"/>
     <w:link w:val="CitaviBibliographySubheading3"/>
     <w:uiPriority w:val="99"/>
     <w:rsid w:val="000700DB"/>
@@ -3637,7 +3656,7 @@
   </w:style>
   <w:style w:type="paragraph" w:customStyle="1" w:styleId="CitaviBibliographySubheading4">
     <w:name w:val="Citavi Bibliography Subheading 4"/>
-    <w:basedOn w:val="berschrift5"/>
+    <w:basedOn w:val="Heading5"/>
     <w:link w:val="CitaviBibliographySubheading4Zchn"/>
     <w:uiPriority w:val="99"/>
     <w:rsid w:val="000700DB"/>
@@ -3647,7 +3666,7 @@
   </w:style>
   <w:style w:type="character" w:customStyle="1" w:styleId="CitaviBibliographySubheading4Zchn">
     <w:name w:val="Citavi Bibliography Subheading 4 Zchn"/>
-    <w:basedOn w:val="berschrift1Zchn"/>
+    <w:basedOn w:val="Heading1Char"/>
     <w:link w:val="CitaviBibliographySubheading4"/>
     <w:uiPriority w:val="99"/>
     <w:rsid w:val="000700DB"/>
@@ -3658,7 +3677,7 @@
   </w:style>
   <w:style w:type="paragraph" w:customStyle="1" w:styleId="CitaviBibliographySubheading5">
     <w:name w:val="Citavi Bibliography Subheading 5"/>
-    <w:basedOn w:val="berschrift6"/>
+    <w:basedOn w:val="Heading6"/>
     <w:link w:val="CitaviBibliographySubheading5Zchn"/>
     <w:uiPriority w:val="99"/>
     <w:rsid w:val="000700DB"/>
@@ -3671,7 +3690,7 @@
   </w:style>
   <w:style w:type="character" w:customStyle="1" w:styleId="CitaviBibliographySubheading5Zchn">
     <w:name w:val="Citavi Bibliography Subheading 5 Zchn"/>
-    <w:basedOn w:val="berschrift1Zchn"/>
+    <w:basedOn w:val="Heading1Char"/>
     <w:link w:val="CitaviBibliographySubheading5"/>
     <w:uiPriority w:val="99"/>
     <w:rsid w:val="000700DB"/>
@@ -3682,10 +3701,10 @@
       <w:color w:val="1F4D78" w:themeColor="accent1" w:themeShade="7F"/>
     </w:rPr>
   </w:style>
-  <w:style w:type="character" w:customStyle="1" w:styleId="berschrift6Zchn">
-    <w:name w:val="Überschrift 6 Zchn"/>
-    <w:basedOn w:val="Absatz-Standardschriftart"/>
-    <w:link w:val="berschrift6"/>
+  <w:style w:type="character" w:customStyle="1" w:styleId="Heading6Char">
+    <w:name w:val="Heading 6 Char"/>
+    <w:basedOn w:val="DefaultParagraphFont"/>
+    <w:link w:val="Heading6"/>
     <w:semiHidden/>
     <w:rsid w:val="000700DB"/>
     <w:rPr>
@@ -3695,7 +3714,7 @@
   </w:style>
   <w:style w:type="paragraph" w:customStyle="1" w:styleId="CitaviBibliographySubheading6">
     <w:name w:val="Citavi Bibliography Subheading 6"/>
-    <w:basedOn w:val="berschrift7"/>
+    <w:basedOn w:val="Heading7"/>
     <w:link w:val="CitaviBibliographySubheading6Zchn"/>
     <w:uiPriority w:val="99"/>
     <w:rsid w:val="000700DB"/>
@@ -3708,7 +3727,7 @@
   </w:style>
   <w:style w:type="character" w:customStyle="1" w:styleId="CitaviBibliographySubheading6Zchn">
     <w:name w:val="Citavi Bibliography Subheading 6 Zchn"/>
-    <w:basedOn w:val="berschrift1Zchn"/>
+    <w:basedOn w:val="Heading1Char"/>
     <w:link w:val="CitaviBibliographySubheading6"/>
     <w:uiPriority w:val="99"/>
     <w:rsid w:val="000700DB"/>
@@ -3721,10 +3740,10 @@
       <w:color w:val="1F4D78" w:themeColor="accent1" w:themeShade="7F"/>
     </w:rPr>
   </w:style>
-  <w:style w:type="character" w:customStyle="1" w:styleId="berschrift7Zchn">
-    <w:name w:val="Überschrift 7 Zchn"/>
-    <w:basedOn w:val="Absatz-Standardschriftart"/>
-    <w:link w:val="berschrift7"/>
+  <w:style w:type="character" w:customStyle="1" w:styleId="Heading7Char">
+    <w:name w:val="Heading 7 Char"/>
+    <w:basedOn w:val="DefaultParagraphFont"/>
+    <w:link w:val="Heading7"/>
     <w:semiHidden/>
     <w:rsid w:val="000700DB"/>
     <w:rPr>
@@ -3736,7 +3755,7 @@
   </w:style>
   <w:style w:type="paragraph" w:customStyle="1" w:styleId="CitaviBibliographySubheading7">
     <w:name w:val="Citavi Bibliography Subheading 7"/>
-    <w:basedOn w:val="berschrift8"/>
+    <w:basedOn w:val="Heading8"/>
     <w:link w:val="CitaviBibliographySubheading7Zchn"/>
     <w:uiPriority w:val="99"/>
     <w:rsid w:val="000700DB"/>
@@ -3749,7 +3768,7 @@
   </w:style>
   <w:style w:type="character" w:customStyle="1" w:styleId="CitaviBibliographySubheading7Zchn">
     <w:name w:val="Citavi Bibliography Subheading 7 Zchn"/>
-    <w:basedOn w:val="berschrift1Zchn"/>
+    <w:basedOn w:val="Heading1Char"/>
     <w:link w:val="CitaviBibliographySubheading7"/>
     <w:uiPriority w:val="99"/>
     <w:rsid w:val="000700DB"/>
@@ -3762,10 +3781,10 @@
       <w:szCs w:val="21"/>
     </w:rPr>
   </w:style>
-  <w:style w:type="character" w:customStyle="1" w:styleId="berschrift8Zchn">
-    <w:name w:val="Überschrift 8 Zchn"/>
-    <w:basedOn w:val="Absatz-Standardschriftart"/>
-    <w:link w:val="berschrift8"/>
+  <w:style w:type="character" w:customStyle="1" w:styleId="Heading8Char">
+    <w:name w:val="Heading 8 Char"/>
+    <w:basedOn w:val="DefaultParagraphFont"/>
+    <w:link w:val="Heading8"/>
     <w:semiHidden/>
     <w:rsid w:val="000700DB"/>
     <w:rPr>
@@ -3777,7 +3796,7 @@
   </w:style>
   <w:style w:type="paragraph" w:customStyle="1" w:styleId="CitaviBibliographySubheading8">
     <w:name w:val="Citavi Bibliography Subheading 8"/>
-    <w:basedOn w:val="berschrift9"/>
+    <w:basedOn w:val="Heading9"/>
     <w:link w:val="CitaviBibliographySubheading8Zchn"/>
     <w:uiPriority w:val="99"/>
     <w:rsid w:val="000700DB"/>
@@ -3790,7 +3809,7 @@
   </w:style>
   <w:style w:type="character" w:customStyle="1" w:styleId="CitaviBibliographySubheading8Zchn">
     <w:name w:val="Citavi Bibliography Subheading 8 Zchn"/>
-    <w:basedOn w:val="berschrift1Zchn"/>
+    <w:basedOn w:val="Heading1Char"/>
     <w:link w:val="CitaviBibliographySubheading8"/>
     <w:uiPriority w:val="99"/>
     <w:rsid w:val="000700DB"/>
@@ -3805,10 +3824,10 @@
       <w:szCs w:val="21"/>
     </w:rPr>
   </w:style>
-  <w:style w:type="character" w:customStyle="1" w:styleId="berschrift9Zchn">
-    <w:name w:val="Überschrift 9 Zchn"/>
-    <w:basedOn w:val="Absatz-Standardschriftart"/>
-    <w:link w:val="berschrift9"/>
+  <w:style w:type="character" w:customStyle="1" w:styleId="Heading9Char">
+    <w:name w:val="Heading 9 Char"/>
+    <w:basedOn w:val="DefaultParagraphFont"/>
+    <w:link w:val="Heading9"/>
     <w:semiHidden/>
     <w:rsid w:val="000700DB"/>
     <w:rPr>
@@ -3820,9 +3839,9 @@
       <w:szCs w:val="21"/>
     </w:rPr>
   </w:style>
-  <w:style w:type="character" w:styleId="Platzhaltertext">
+  <w:style w:type="character" w:styleId="PlaceholderText">
     <w:name w:val="Placeholder Text"/>
-    <w:basedOn w:val="Absatz-Standardschriftart"/>
+    <w:basedOn w:val="DefaultParagraphFont"/>
     <w:uiPriority w:val="99"/>
     <w:semiHidden/>
     <w:rsid w:val="000700DB"/>
@@ -3834,7 +3853,7 @@
 </file>
 
 <file path=word/glossary/document.xml><?xml version="1.0" encoding="utf-8"?>
-<w:glossaryDocument xmlns:cx="http://schemas.microsoft.com/office/drawing/2014/chartex" xmlns:cx1="http://schemas.microsoft.com/office/drawing/2015/9/8/chartex" xmlns:cx2="http://schemas.microsoft.com/office/drawing/2015/10/21/chartex" xmlns:cx3="http://schemas.microsoft.com/office/drawing/2016/5/9/chartex" xmlns:cx4="http://schemas.microsoft.com/office/drawing/2016/5/10/chartex" xmlns:cx5="http://schemas.microsoft.com/office/drawing/2016/5/11/chartex" xmlns:cx6="http://schemas.microsoft.com/office/drawing/2016/5/12/chartex" xmlns:cx7="http://schemas.microsoft.com/office/drawing/2016/5/13/chartex" xmlns:cx8="http://schemas.microsoft.com/office/drawing/2016/5/14/chartex" xmlns:mc="http://schemas.openxmlformats.org/markup-compatibility/2006" xmlns:aink="http://schemas.microsoft.com/office/drawing/2016/ink" xmlns:am3d="http://schemas.microsoft.com/office/drawing/2017/model3d" xmlns:o="urn:schemas-microsoft-com:office:office" xmlns:oel="http://schemas.microsoft.com/office/2019/extlst" xmlns:r="http://purl.oclc.org/ooxml/officeDocument/relationships" xmlns:m="http://purl.oclc.org/ooxml/officeDocument/math" xmlns:v="urn:schemas-microsoft-com:vml" xmlns:wp14="http://schemas.microsoft.com/office/word/2010/wordprocessingDrawing" xmlns:wp="http://purl.oclc.org/ooxml/drawingml/wordprocessingDrawing" xmlns:w10="urn:schemas-microsoft-com:office:word" xmlns:w="http://purl.oclc.org/ooxml/wordprocessingml/main" xmlns:w14="http://schemas.microsoft.com/office/word/2010/wordml" xmlns:w15="http://schemas.microsoft.com/office/word/2012/wordml" xmlns:w16cex="http://schemas.microsoft.com/office/word/2018/wordml/cex" xmlns:w16cid="http://schemas.microsoft.com/office/word/2016/wordml/cid" xmlns:w16="http://schemas.microsoft.com/office/word/2018/wordml" xmlns:w16du="http://schemas.microsoft.com/office/word/2023/wordml/word16du" xmlns:w16sdtdh="http://schemas.microsoft.com/office/word/2020/wordml/sdtdatahash" xmlns:w16sdtfl="http://schemas.microsoft.com/office/word/2024/wordml/sdtformatlock" xmlns:w16se="http://schemas.microsoft.com/office/word/2015/wordml/symex" xmlns:wpi="http://schemas.microsoft.com/office/word/2010/wordprocessingInk" xmlns:wne="http://schemas.microsoft.com/office/word/2006/wordml" mc:Ignorable="w14 w15 w16se w16cid w16 w16cex w16sdtdh w16sdtfl w16du wne wp14">
+<w:glossaryDocument xmlns:cx="http://schemas.microsoft.com/office/drawing/2014/chartex" xmlns:cx1="http://schemas.microsoft.com/office/drawing/2015/9/8/chartex" xmlns:mc="http://schemas.openxmlformats.org/markup-compatibility/2006" xmlns:o="urn:schemas-microsoft-com:office:office" xmlns:r="http://purl.oclc.org/ooxml/officeDocument/relationships" xmlns:m="http://purl.oclc.org/ooxml/officeDocument/math" xmlns:v="urn:schemas-microsoft-com:vml" xmlns:wp14="http://schemas.microsoft.com/office/word/2010/wordprocessingDrawing" xmlns:wp="http://purl.oclc.org/ooxml/drawingml/wordprocessingDrawing" xmlns:w10="urn:schemas-microsoft-com:office:word" xmlns:w="http://purl.oclc.org/ooxml/wordprocessingml/main" xmlns:w14="http://schemas.microsoft.com/office/word/2010/wordml" xmlns:w15="http://schemas.microsoft.com/office/word/2012/wordml" xmlns:w16se="http://schemas.microsoft.com/office/word/2015/wordml/symex" xmlns:wpi="http://schemas.microsoft.com/office/word/2010/wordprocessingInk" xmlns:wne="http://schemas.microsoft.com/office/word/2006/wordml" mc:Ignorable="w14 w15 w16se wne wp14">
   <w:docParts>
     <w:docPart>
       <w:docPartPr>
@@ -3858,7 +3877,7 @@
           </w:pPr>
           <w:r>
             <w:rPr>
-              <w:rStyle w:val="Platzhaltertext"/>
+              <w:rStyle w:val="PlaceholderText"/>
             </w:rPr>
             <w:t>Klicken oder tippen Sie hier, um Text einzugeben.</w:t>
           </w:r>
@@ -3884,7 +3903,7 @@
         <w:p>
           <w:r>
             <w:rPr>
-              <w:rStyle w:val="Platzhaltertext"/>
+              <w:rStyle w:val="PlaceholderText"/>
             </w:rPr>
             <w:t>Klicken oder tippen Sie hier, um Text einzugeben.</w:t>
           </w:r>
@@ -3913,7 +3932,7 @@
           </w:pPr>
           <w:r>
             <w:rPr>
-              <w:rStyle w:val="Platzhaltertext"/>
+              <w:rStyle w:val="PlaceholderText"/>
             </w:rPr>
             <w:t>Klicken oder tippen Sie hier, um Text einzugeben.</w:t>
           </w:r>
@@ -3925,7 +3944,7 @@
 </file>
 
 <file path=word/glossary/fontTable.xml><?xml version="1.0" encoding="utf-8"?>
-<w:fonts xmlns:mc="http://schemas.openxmlformats.org/markup-compatibility/2006" xmlns:r="http://purl.oclc.org/ooxml/officeDocument/relationships" xmlns:w="http://purl.oclc.org/ooxml/wordprocessingml/main" xmlns:w14="http://schemas.microsoft.com/office/word/2010/wordml" xmlns:w15="http://schemas.microsoft.com/office/word/2012/wordml" xmlns:w16cex="http://schemas.microsoft.com/office/word/2018/wordml/cex" xmlns:w16cid="http://schemas.microsoft.com/office/word/2016/wordml/cid" xmlns:w16="http://schemas.microsoft.com/office/word/2018/wordml" xmlns:w16du="http://schemas.microsoft.com/office/word/2023/wordml/word16du" xmlns:w16sdtdh="http://schemas.microsoft.com/office/word/2020/wordml/sdtdatahash" xmlns:w16sdtfl="http://schemas.microsoft.com/office/word/2024/wordml/sdtformatlock" xmlns:w16se="http://schemas.microsoft.com/office/word/2015/wordml/symex" mc:Ignorable="w14 w15 w16se w16cid w16 w16cex w16sdtdh w16sdtfl w16du">
+<w:fonts xmlns:mc="http://schemas.openxmlformats.org/markup-compatibility/2006" xmlns:r="http://purl.oclc.org/ooxml/officeDocument/relationships" xmlns:w="http://purl.oclc.org/ooxml/wordprocessingml/main" xmlns:w14="http://schemas.microsoft.com/office/word/2010/wordml" xmlns:w15="http://schemas.microsoft.com/office/word/2012/wordml" xmlns:w16se="http://schemas.microsoft.com/office/word/2015/wordml/symex" mc:Ignorable="w14 w15 w16se">
   <w:font w:name="Symbol">
     <w:panose1 w:val="05050102010706020507"/>
     <w:family w:val="roman"/>
@@ -3965,9 +3984,10 @@
     <w:charset w:characterSet="iso-8859-1"/>
     <w:family w:val="swiss"/>
     <w:pitch w:val="variable"/>
-    <w:sig w:usb0="E4002EFF" w:usb1="C200247B" w:usb2="00000009" w:usb3="00000000" w:csb0="000001FF" w:csb1="00000000"/>
+    <w:sig w:usb0="E4002EFF" w:usb1="C000247B" w:usb2="00000009" w:usb3="00000000" w:csb0="000001FF" w:csb1="00000000"/>
   </w:font>
   <w:font w:name="MS Mincho">
+    <w:altName w:val="ＭＳ 明朝"/>
     <w:panose1 w:val="02020609040205080304"/>
     <w:charset w:characterSet="shift_jis"/>
     <w:family w:val="modern"/>
@@ -3979,13 +3999,13 @@
     <w:charset w:characterSet="iso-8859-1"/>
     <w:family w:val="swiss"/>
     <w:pitch w:val="variable"/>
-    <w:sig w:usb0="E4002EFF" w:usb1="C200247B" w:usb2="00000009" w:usb3="00000000" w:csb0="000001FF" w:csb1="00000000"/>
+    <w:sig w:usb0="E4002EFF" w:usb1="C000247B" w:usb2="00000009" w:usb3="00000000" w:csb0="000001FF" w:csb1="00000000"/>
   </w:font>
 </w:fonts>
 </file>
 
 <file path=word/glossary/settings.xml><?xml version="1.0" encoding="utf-8"?>
-<w:settings xmlns:mc="http://schemas.openxmlformats.org/markup-compatibility/2006" xmlns:o="urn:schemas-microsoft-com:office:office" xmlns:r="http://purl.oclc.org/ooxml/officeDocument/relationships" xmlns:m="http://purl.oclc.org/ooxml/officeDocument/math" xmlns:v="urn:schemas-microsoft-com:vml" xmlns:w10="urn:schemas-microsoft-com:office:word" xmlns:w="http://purl.oclc.org/ooxml/wordprocessingml/main" xmlns:w14="http://schemas.microsoft.com/office/word/2010/wordml" xmlns:w15="http://schemas.microsoft.com/office/word/2012/wordml" xmlns:w16cex="http://schemas.microsoft.com/office/word/2018/wordml/cex" xmlns:w16cid="http://schemas.microsoft.com/office/word/2016/wordml/cid" xmlns:w16="http://schemas.microsoft.com/office/word/2018/wordml" xmlns:w16du="http://schemas.microsoft.com/office/word/2023/wordml/word16du" xmlns:w16sdtdh="http://schemas.microsoft.com/office/word/2020/wordml/sdtdatahash" xmlns:w16sdtfl="http://schemas.microsoft.com/office/word/2024/wordml/sdtformatlock" xmlns:w16se="http://schemas.microsoft.com/office/word/2015/wordml/symex" xmlns:sl="http://schemas.openxmlformats.org/schemaLibrary/2006/main" mc:Ignorable="w14 w15 w16se w16cid w16 w16cex w16sdtdh w16sdtfl w16du">
+<w:settings xmlns:mc="http://schemas.openxmlformats.org/markup-compatibility/2006" xmlns:o="urn:schemas-microsoft-com:office:office" xmlns:r="http://purl.oclc.org/ooxml/officeDocument/relationships" xmlns:m="http://purl.oclc.org/ooxml/officeDocument/math" xmlns:v="urn:schemas-microsoft-com:vml" xmlns:w10="urn:schemas-microsoft-com:office:word" xmlns:w="http://purl.oclc.org/ooxml/wordprocessingml/main" xmlns:w14="http://schemas.microsoft.com/office/word/2010/wordml" xmlns:w15="http://schemas.microsoft.com/office/word/2012/wordml" xmlns:w16se="http://schemas.microsoft.com/office/word/2015/wordml/symex" xmlns:sl="http://schemas.openxmlformats.org/schemaLibrary/2006/main" mc:Ignorable="w14 w15 w16se">
   <w:view w:val="normal"/>
   <w:defaultTabStop w:val="35.40pt"/>
   <w:hyphenationZone w:val="21.25pt"/>
@@ -3996,11 +4016,12 @@
     <w:compatSetting w:name="enableOpenTypeFeatures" w:uri="http://schemas.microsoft.com/office/word" w:val="1"/>
     <w:compatSetting w:name="doNotFlipMirrorIndents" w:uri="http://schemas.microsoft.com/office/word" w:val="1"/>
     <w:compatSetting w:name="differentiateMultirowTableHeaders" w:uri="http://schemas.microsoft.com/office/word" w:val="1"/>
-    <w:compatSetting w:name="useWord2013TrackBottomHyphenation" w:uri="http://schemas.microsoft.com/office/word" w:val="0"/>
   </w:compat>
   <w:rsids>
     <w:rsidRoot w:val="00A74657"/>
     <w:rsid w:val="003C0BAD"/>
+    <w:rsid w:val="00782D6E"/>
+    <w:rsid w:val="00A607CB"/>
     <w:rsid w:val="00A74657"/>
     <w:rsid w:val="00BD7106"/>
   </w:rsids>
@@ -4019,14 +4040,14 @@
   </m:mathPr>
   <w:themeFontLang w:val="de-DE"/>
   <w:clrSchemeMapping w:bg1="light1" w:t1="dark1" w:bg2="light2" w:t2="dark2" w:accent1="accent1" w:accent2="accent2" w:accent3="accent3" w:accent4="accent4" w:accent5="accent5" w:accent6="accent6" w:hyperlink="hyperlink" w:followedHyperlink="followedHyperlink"/>
-  <w:decimalSymbol w:val=","/>
-  <w:listSeparator w:val=";"/>
+  <w:decimalSymbol w:val="."/>
+  <w:listSeparator w:val=","/>
   <w15:chartTrackingRefBased/>
 </w:settings>
 </file>
 
 <file path=word/glossary/styles.xml><?xml version="1.0" encoding="utf-8"?>
-<w:styles xmlns:mc="http://schemas.openxmlformats.org/markup-compatibility/2006" xmlns:r="http://purl.oclc.org/ooxml/officeDocument/relationships" xmlns:w="http://purl.oclc.org/ooxml/wordprocessingml/main" xmlns:w14="http://schemas.microsoft.com/office/word/2010/wordml" xmlns:w15="http://schemas.microsoft.com/office/word/2012/wordml" xmlns:w16cex="http://schemas.microsoft.com/office/word/2018/wordml/cex" xmlns:w16cid="http://schemas.microsoft.com/office/word/2016/wordml/cid" xmlns:w16="http://schemas.microsoft.com/office/word/2018/wordml" xmlns:w16du="http://schemas.microsoft.com/office/word/2023/wordml/word16du" xmlns:w16sdtdh="http://schemas.microsoft.com/office/word/2020/wordml/sdtdatahash" xmlns:w16sdtfl="http://schemas.microsoft.com/office/word/2024/wordml/sdtformatlock" xmlns:w16se="http://schemas.microsoft.com/office/word/2015/wordml/symex" mc:Ignorable="w14 w15 w16se w16cid w16 w16cex w16sdtdh w16sdtfl w16du">
+<w:styles xmlns:mc="http://schemas.openxmlformats.org/markup-compatibility/2006" xmlns:r="http://purl.oclc.org/ooxml/officeDocument/relationships" xmlns:w="http://purl.oclc.org/ooxml/wordprocessingml/main" xmlns:w14="http://schemas.microsoft.com/office/word/2010/wordml" xmlns:w15="http://schemas.microsoft.com/office/word/2012/wordml" xmlns:w16se="http://schemas.microsoft.com/office/word/2015/wordml/symex" mc:Ignorable="w14 w15 w16se">
   <w:docDefaults>
     <w:rPrDefault>
       <w:rPr>
@@ -4044,7 +4065,7 @@
       </w:pPr>
     </w:pPrDefault>
   </w:docDefaults>
-  <w:latentStyles w:defLockedState="0" w:defUIPriority="99" w:defSemiHidden="0" w:defUnhideWhenUsed="0" w:defQFormat="0" w:count="376">
+  <w:latentStyles w:defLockedState="0" w:defUIPriority="99" w:defSemiHidden="0" w:defUnhideWhenUsed="0" w:defQFormat="0" w:count="371">
     <w:lsdException w:name="Normal" w:uiPriority="0" w:qFormat="1"/>
     <w:lsdException w:name="heading 1" w:uiPriority="9" w:qFormat="1"/>
     <w:lsdException w:name="heading 2" w:semiHidden="1" w:uiPriority="9" w:unhideWhenUsed="1" w:qFormat="1"/>
@@ -4416,23 +4437,18 @@
     <w:lsdException w:name="List Table 5 Dark Accent 6" w:uiPriority="50"/>
     <w:lsdException w:name="List Table 6 Colorful Accent 6" w:uiPriority="51"/>
     <w:lsdException w:name="List Table 7 Colorful Accent 6" w:uiPriority="52"/>
-    <w:lsdException w:name="Mention" w:semiHidden="1" w:unhideWhenUsed="1"/>
-    <w:lsdException w:name="Smart Hyperlink" w:semiHidden="1" w:unhideWhenUsed="1"/>
-    <w:lsdException w:name="Hashtag" w:semiHidden="1" w:unhideWhenUsed="1"/>
-    <w:lsdException w:name="Unresolved Mention" w:semiHidden="1" w:unhideWhenUsed="1"/>
-    <w:lsdException w:name="Smart Link" w:semiHidden="1" w:unhideWhenUsed="1"/>
   </w:latentStyles>
-  <w:style w:type="paragraph" w:default="1" w:styleId="Standard">
+  <w:style w:type="paragraph" w:default="1" w:styleId="Normal">
     <w:name w:val="Normal"/>
     <w:qFormat/>
   </w:style>
-  <w:style w:type="character" w:default="1" w:styleId="Absatz-Standardschriftart">
+  <w:style w:type="character" w:default="1" w:styleId="DefaultParagraphFont">
     <w:name w:val="Default Paragraph Font"/>
     <w:uiPriority w:val="1"/>
     <w:semiHidden/>
     <w:unhideWhenUsed/>
   </w:style>
-  <w:style w:type="table" w:default="1" w:styleId="NormaleTabelle">
+  <w:style w:type="table" w:default="1" w:styleId="TableNormal">
     <w:name w:val="Normal Table"/>
     <w:uiPriority w:val="99"/>
     <w:semiHidden/>
@@ -4447,15 +4463,15 @@
       </w:tblCellMar>
     </w:tblPr>
   </w:style>
-  <w:style w:type="numbering" w:default="1" w:styleId="KeineListe">
+  <w:style w:type="numbering" w:default="1" w:styleId="NoList">
     <w:name w:val="No List"/>
     <w:uiPriority w:val="99"/>
     <w:semiHidden/>
     <w:unhideWhenUsed/>
   </w:style>
-  <w:style w:type="character" w:styleId="Platzhaltertext">
+  <w:style w:type="character" w:styleId="PlaceholderText">
     <w:name w:val="Placeholder Text"/>
-    <w:basedOn w:val="Absatz-Standardschriftart"/>
+    <w:basedOn w:val="DefaultParagraphFont"/>
     <w:uiPriority w:val="99"/>
     <w:semiHidden/>
     <w:rsid w:val="00A74657"/>
@@ -4475,7 +4491,7 @@
 </file>
 
 <file path=word/glossary/webSettings.xml><?xml version="1.0" encoding="utf-8"?>
-<w:webSettings xmlns:mc="http://schemas.openxmlformats.org/markup-compatibility/2006" xmlns:r="http://purl.oclc.org/ooxml/officeDocument/relationships" xmlns:w="http://purl.oclc.org/ooxml/wordprocessingml/main" xmlns:w14="http://schemas.microsoft.com/office/word/2010/wordml" xmlns:w15="http://schemas.microsoft.com/office/word/2012/wordml" xmlns:w16cex="http://schemas.microsoft.com/office/word/2018/wordml/cex" xmlns:w16cid="http://schemas.microsoft.com/office/word/2016/wordml/cid" xmlns:w16="http://schemas.microsoft.com/office/word/2018/wordml" xmlns:w16du="http://schemas.microsoft.com/office/word/2023/wordml/word16du" xmlns:w16sdtdh="http://schemas.microsoft.com/office/word/2020/wordml/sdtdatahash" xmlns:w16sdtfl="http://schemas.microsoft.com/office/word/2024/wordml/sdtformatlock" xmlns:w16se="http://schemas.microsoft.com/office/word/2015/wordml/symex" mc:Ignorable="w14 w15 w16se w16cid w16 w16cex w16sdtdh w16sdtfl w16du">
+<w:webSettings xmlns:mc="http://schemas.openxmlformats.org/markup-compatibility/2006" xmlns:r="http://purl.oclc.org/ooxml/officeDocument/relationships" xmlns:w="http://purl.oclc.org/ooxml/wordprocessingml/main" xmlns:w14="http://schemas.microsoft.com/office/word/2010/wordml" xmlns:w15="http://schemas.microsoft.com/office/word/2012/wordml" xmlns:w16se="http://schemas.microsoft.com/office/word/2015/wordml/symex" mc:Ignorable="w14 w15 w16se">
   <w:optimizeForBrowser/>
   <w:allowPNG/>
 </w:webSettings>
@@ -4747,7 +4763,7 @@
 </file>
 
 <file path=customXml/itemProps1.xml><?xml version="1.0" encoding="utf-8"?>
-<ds:datastoreItem xmlns:ds="http://purl.oclc.org/ooxml/officeDocument/customXml" ds:itemID="{9E966C7F-158E-4883-86A6-4454069232BB}">
+<ds:datastoreItem xmlns:ds="http://purl.oclc.org/ooxml/officeDocument/customXml" ds:itemID="{B953FDF9-4F89-48C5-9080-42739BE24C20}">
   <ds:schemaRefs>
     <ds:schemaRef ds:uri="http://schemas.openxmlformats.org/officeDocument/2006/bibliography"/>
   </ds:schemaRefs>

</xml_diff>

<commit_message>
Slightly shortened the proposal to fit onto one page
</commit_message>
<xml_diff>
--- a/Documentation/Final_Proposal.docx
+++ b/Documentation/Final_Proposal.docx
@@ -209,6 +209,7 @@
             <w:docPart w:val="482DD34A552843CA9F1513CEAE196551"/>
           </w:placeholder>
         </w:sdtPr>
+        <w:sdtEndPr/>
         <w:sdtContent>
           <w:r>
             <w:rPr>
@@ -260,6 +261,7 @@
             <w:docPart w:val="482DD34A552843CA9F1513CEAE196551"/>
           </w:placeholder>
         </w:sdtPr>
+        <w:sdtEndPr/>
         <w:sdtContent>
           <w:r>
             <w:rPr>
@@ -297,7 +299,55 @@
         <w:rPr>
           <w:lang w:val="en-US"/>
         </w:rPr>
-        <w:t xml:space="preserve">. These works relied on vision-based systems to provide the partial geometric information and showed a reconstruction quality. But for industrial applications robots often have to be cheap and are often not equipped with camera systems. Furthermore, robots in an industrial setting often have to work in darkness or in small occluded work spaces where vision cannot be provided. To resolve this issue other works explored the idea of reconstructing object shapes from tactile sensing </w:t>
+        <w:t>. These works rel</w:t>
+      </w:r>
+      <w:r>
+        <w:rPr>
+          <w:lang w:val="en-US"/>
+        </w:rPr>
+        <w:t>ied</w:t>
+      </w:r>
+      <w:r>
+        <w:rPr>
+          <w:lang w:val="en-US"/>
+        </w:rPr>
+        <w:t xml:space="preserve"> on vision-based systems to provide the partial geometric informatio</w:t>
+      </w:r>
+      <w:r>
+        <w:rPr>
+          <w:lang w:val="en-US"/>
+        </w:rPr>
+        <w:t xml:space="preserve">n. </w:t>
+      </w:r>
+      <w:r>
+        <w:rPr>
+          <w:lang w:val="en-US"/>
+        </w:rPr>
+        <w:t xml:space="preserve">But for industrial applications robots have to be cheap and are often not equipped with camera systems. Furthermore, robots in an industrial setting often have to work </w:t>
+      </w:r>
+      <w:r>
+        <w:rPr>
+          <w:lang w:val="en-US"/>
+        </w:rPr>
+        <w:t>under bad lighting conditions</w:t>
+      </w:r>
+      <w:r>
+        <w:rPr>
+          <w:lang w:val="en-US"/>
+        </w:rPr>
+        <w:t xml:space="preserve"> or in small occluded work spaces</w:t>
+      </w:r>
+      <w:r>
+        <w:rPr>
+          <w:lang w:val="en-US"/>
+        </w:rPr>
+        <w:t>,</w:t>
+      </w:r>
+      <w:r>
+        <w:rPr>
+          <w:lang w:val="en-US"/>
+        </w:rPr>
+        <w:t xml:space="preserve"> where vision cannot be provided. To resolve this issue other works explored the idea of reconstructing object shapes from tactile sensing </w:t>
       </w:r>
       <w:sdt>
         <w:sdtPr>
@@ -311,6 +361,7 @@
             <w:docPart w:val="482DD34A552843CA9F1513CEAE196551"/>
           </w:placeholder>
         </w:sdtPr>
+        <w:sdtEndPr/>
         <w:sdtContent>
           <w:r>
             <w:rPr>
@@ -348,7 +399,79 @@
         <w:rPr>
           <w:lang w:val="en-US"/>
         </w:rPr>
-        <w:t xml:space="preserve">- These works rely tactile sensors that generate a pressure image of the contact surface and extract features with vision transformers or convolutional networks from the images with great effectiveness. But we are interested in the task of shape completion based on internal geometric information like the joint angles and not any geometric information provided by sensors as there has been done little research in this direction. So our project asks the question how much geometric information is encoded in the interaction between the robot hand and the object and is it possible to reconstruct valid object shapes from that information. The closest work that investigated this idea is UGG from </w:t>
+        <w:t xml:space="preserve">- These works </w:t>
+      </w:r>
+      <w:r>
+        <w:rPr>
+          <w:lang w:val="en-US"/>
+        </w:rPr>
+        <w:t>use</w:t>
+      </w:r>
+      <w:r>
+        <w:rPr>
+          <w:lang w:val="en-US"/>
+        </w:rPr>
+        <w:t xml:space="preserve"> tactile sensors that generate a pressure image of the contact surface </w:t>
+      </w:r>
+      <w:r>
+        <w:rPr>
+          <w:lang w:val="en-US"/>
+        </w:rPr>
+        <w:t>from which they extract features with transformer or convolution networks.</w:t>
+      </w:r>
+      <w:r>
+        <w:rPr>
+          <w:lang w:val="en-US"/>
+        </w:rPr>
+        <w:t xml:space="preserve">  </w:t>
+      </w:r>
+      <w:r>
+        <w:rPr>
+          <w:lang w:val="en-US"/>
+        </w:rPr>
+        <w:t>W</w:t>
+      </w:r>
+      <w:r>
+        <w:rPr>
+          <w:lang w:val="en-US"/>
+        </w:rPr>
+        <w:t xml:space="preserve">e are interested in the task of shape completion based </w:t>
+      </w:r>
+      <w:r>
+        <w:rPr>
+          <w:lang w:val="en-US"/>
+        </w:rPr>
+        <w:t>from the joint angles of the robot hand, when it is grasping the object.</w:t>
+      </w:r>
+      <w:r>
+        <w:rPr>
+          <w:lang w:val="en-US"/>
+        </w:rPr>
+        <w:t xml:space="preserve"> So</w:t>
+      </w:r>
+      <w:r>
+        <w:rPr>
+          <w:lang w:val="en-US"/>
+        </w:rPr>
+        <w:t>,</w:t>
+      </w:r>
+      <w:r>
+        <w:rPr>
+          <w:lang w:val="en-US"/>
+        </w:rPr>
+        <w:t xml:space="preserve"> </w:t>
+      </w:r>
+      <w:r>
+        <w:rPr>
+          <w:lang w:val="en-US"/>
+        </w:rPr>
+        <w:t>we focus on the geometric information that is inherently coded into the hand-object interaction without the reliance on tactile sensors.</w:t>
+      </w:r>
+      <w:r>
+        <w:rPr>
+          <w:lang w:val="en-US"/>
+        </w:rPr>
+        <w:t xml:space="preserve"> The closest work that investigated this idea is UGG from </w:t>
       </w:r>
       <w:sdt>
         <w:sdtPr>
@@ -362,6 +485,7 @@
             <w:docPart w:val="482DD34A552843CA9F1513CEAE196551"/>
           </w:placeholder>
         </w:sdtPr>
+        <w:sdtEndPr/>
         <w:sdtContent>
           <w:r>
             <w:rPr>
@@ -399,13 +523,31 @@
         <w:rPr>
           <w:lang w:val="en-US"/>
         </w:rPr>
-        <w:t xml:space="preserve">. In UGG the authors </w:t>
+        <w:t>. In UGG the authors introduced a unified latent space where object O and grasp G where modeled as a joint probability P(G, O). The authors show</w:t>
       </w:r>
       <w:r>
         <w:rPr>
           <w:lang w:val="en-US"/>
         </w:rPr>
-        <w:t xml:space="preserve">introduced a unified latent space where object O and grasp G where modeled as a joint probability P(G, O). The authors show that this latent space allows for training both the conditional generation of objects and grasps. While this approach is interesting, we want to develop a direct strategy by directly training the diffusion model to learn the conditional probability of generating objects from a given grasp P(O|G) and compare our results to UGG. </w:t>
+        <w:t>ed</w:t>
+      </w:r>
+      <w:r>
+        <w:rPr>
+          <w:lang w:val="en-US"/>
+        </w:rPr>
+        <w:t xml:space="preserve"> that this latent space allows for training both the conditional generation of objects and grasps. While this approach is interesting, we want to develop a direct strategy by directly training the diffusion model to learn the conditional probability of generating objects from a given grasp P(O|G) and compare our results </w:t>
+      </w:r>
+      <w:r>
+        <w:rPr>
+          <w:lang w:val="en-US"/>
+        </w:rPr>
+        <w:t>with</w:t>
+      </w:r>
+      <w:r>
+        <w:rPr>
+          <w:lang w:val="en-US"/>
+        </w:rPr>
+        <w:t xml:space="preserve"> UGG. </w:t>
       </w:r>
     </w:p>
     <w:p>
@@ -432,6 +574,7 @@
             <w:docPart w:val="974F459B38BE4EC4B15956B314CF5259"/>
           </w:placeholder>
         </w:sdtPr>
+        <w:sdtEndPr/>
         <w:sdtContent>
           <w:r>
             <w:fldChar w:fldCharType="begin"/>
@@ -462,6 +605,7 @@
             <w:docPart w:val="974F459B38BE4EC4B15956B314CF5259"/>
           </w:placeholder>
         </w:sdtPr>
+        <w:sdtEndPr/>
         <w:sdtContent>
           <w:r>
             <w:fldChar w:fldCharType="begin"/>
@@ -481,7 +625,22 @@
         </w:sdtContent>
       </w:sdt>
       <w:r>
-        <w:t xml:space="preserve"> process can be performed in the latent space to accelerate the training, while retaining very high state of the art generation quality. As we are dealing with high-dimensional 3d Data and have limited computing resources latent diffusion will be key in giving us good generation quality for a reasonable amount of computing cost. Other works have proven that latent diffusion modeling for 3d point cloud data achieves good results </w:t>
+        <w:t xml:space="preserve"> process can be performed in the latent space to accelerate the training, while retaining state of the art generation quality. As we are dealing with high-dimensional 3d </w:t>
+      </w:r>
+      <w:r>
+        <w:t>d</w:t>
+      </w:r>
+      <w:r>
+        <w:t xml:space="preserve">ata and have limited computing resources latent diffusion will be key in giving us good generation quality </w:t>
+      </w:r>
+      <w:r>
+        <w:t>for reasonable computational costs</w:t>
+      </w:r>
+      <w:r>
+        <w:t xml:space="preserve">. </w:t>
+      </w:r>
+      <w:r>
+        <w:t xml:space="preserve">In order to further reduce the computational costs we decided to represent the objects as point clouds. Recent works have proven that the training and reconstruction of point clouds with diffusion models achieves very good results </w:t>
       </w:r>
       <w:sdt>
         <w:sdtPr>
@@ -492,6 +651,7 @@
             <w:docPart w:val="974F459B38BE4EC4B15956B314CF5259"/>
           </w:placeholder>
         </w:sdtPr>
+        <w:sdtEndPr/>
         <w:sdtContent>
           <w:r>
             <w:fldChar w:fldCharType="begin"/>
@@ -511,15 +671,7 @@
         </w:sdtContent>
       </w:sdt>
       <w:r>
-        <w:t xml:space="preserve">. So we want to stick with point clouds as well, as there is much groundwork that we can rely on from past works and point clouds represent a budget friendly way of modeling the surface of a 3d object. For latent diffusion the VAE is of great importance as it generates the latent codes to perform the diffusion on. For our work we would like to experiment with different VAEs. </w:t>
-      </w:r>
-      <w:proofErr w:type="spellStart"/>
-      <w:r>
-        <w:t>Pointnet</w:t>
-      </w:r>
-      <w:proofErr w:type="spellEnd"/>
-      <w:r>
-        <w:t xml:space="preserve">++ and PVCNN </w:t>
+        <w:t xml:space="preserve">. For latent diffusion the VAE is of great importance as it generates the latent code to perform the diffusion on. For our work we would like to experiment with different VAEs. Pointnet++ and PVCNN </w:t>
       </w:r>
       <w:sdt>
         <w:sdtPr>
@@ -530,6 +682,7 @@
             <w:docPart w:val="974F459B38BE4EC4B15956B314CF5259"/>
           </w:placeholder>
         </w:sdtPr>
+        <w:sdtEndPr/>
         <w:sdtContent>
           <w:r>
             <w:fldChar w:fldCharType="begin"/>
@@ -549,15 +702,7 @@
         </w:sdtContent>
       </w:sdt>
       <w:r>
-        <w:t xml:space="preserve"> are popular and easy to use autoencoders that generate global shape </w:t>
-      </w:r>
-      <w:proofErr w:type="spellStart"/>
-      <w:r>
-        <w:t>latents</w:t>
-      </w:r>
-      <w:proofErr w:type="spellEnd"/>
-      <w:r>
-        <w:t xml:space="preserve">. LION </w:t>
+        <w:t xml:space="preserve"> are popular and easy to use autoencoders that generate global shape latents. LION </w:t>
       </w:r>
       <w:sdt>
         <w:sdtPr>
@@ -568,6 +713,7 @@
             <w:docPart w:val="974F459B38BE4EC4B15956B314CF5259"/>
           </w:placeholder>
         </w:sdtPr>
+        <w:sdtEndPr/>
         <w:sdtContent>
           <w:r>
             <w:fldChar w:fldCharType="begin"/>
@@ -587,7 +733,7 @@
         </w:sdtContent>
       </w:sdt>
       <w:r>
-        <w:t xml:space="preserve"> a more advanced architecture that suits or our needs perfectly constructs both a global shape latent and a point structure latent that better retains the geometrical structure of the original point cloud, thus providing the diffusion model with more geometric information. Then the diffusion model itself must be considered. Traditional latent diffusion models leverage a U-Net Design that relies on convolution layers </w:t>
+        <w:t xml:space="preserve"> a more advanced architecture constructs both a global shape latent and a point structure latent that better retains the geometrical structure of the original point cloud, thus providing the diffusion model with more geometric information. Then the diffusion model itself must be considered. Traditional latent diffusion models leverage a U-Net Design that relies on convolution layers </w:t>
       </w:r>
       <w:sdt>
         <w:sdtPr>
@@ -598,6 +744,7 @@
             <w:docPart w:val="974F459B38BE4EC4B15956B314CF5259"/>
           </w:placeholder>
         </w:sdtPr>
+        <w:sdtEndPr/>
         <w:sdtContent>
           <w:r>
             <w:fldChar w:fldCharType="begin"/>
@@ -628,6 +775,7 @@
             <w:docPart w:val="974F459B38BE4EC4B15956B314CF5259"/>
           </w:placeholder>
         </w:sdtPr>
+        <w:sdtEndPr/>
         <w:sdtContent>
           <w:r>
             <w:fldChar w:fldCharType="begin"/>
@@ -647,22 +795,24 @@
         </w:sdtContent>
       </w:sdt>
       <w:r>
-        <w:t xml:space="preserve">. These works showed that transformers are very good in preserving the shape of the original object as the point cloud can be tokenized and enhanced with a positional encoding and fed to the transformer. Enhancing the input and feeding the model different input modalities like the joint angles, a point cloud of the robot hand or contact points between hand and object, will also be investigated. But for the start of the project, we will keep the model as simple as possible to have a solid baseline that can be improved upon. For the first two weeks we will explore the provided training data and try out VAEs with pretrained weights. Then we will a develop a simple architecture baseline of VAE that generates a global latent. Perform diffusion on the latent and let the model learn to denoise the latent. The feed the denoised latent to the decoder. So, the first baseline will be unconditional generation of shapes and two ease the problem </w:t>
-      </w:r>
-      <w:r>
-        <w:lastRenderedPageBreak/>
-        <w:t xml:space="preserve">we could stick to only one object category at first, thus reducing the problem to a unimodal distribution, and try to overfit the model to a small dataset. If the model training loss improves and the model shows that it can overfit to a small easy dataset, we can iteratively increase the dataset size until we can be sure that the model can learn the distribution. If for instance, the model shows no convergence, then we can increase the model capacity or switch the architecture. If the model shows good convergence during training and </w:t>
-      </w:r>
-      <w:r>
-        <w:t xml:space="preserve">satisfying reconstruction quality we can add more features, for example grasp-conditional object reconstruction. We can try out different architectures with this approach compare them and when we finalized the architecture, we can experiment with more advanced techniques like cross-attention as a conditioning mechanism. Feeding the network different input modalities. Trying out implicit diffusion </w:t>
+        <w:t xml:space="preserve">. These works showed that transformers are very good in preserving the shape of the original object </w:t>
+      </w:r>
+      <w:r>
+        <w:t>by tokenizing the object point cloud and using positional encoding on the tokens. We will also investigate different input modalities besides the joint angles of the robot hand like for instance a point cloud representation of the robot’s hand and its effect on reconstruction quality and training time</w:t>
+      </w:r>
+      <w:r>
+        <w:t>.</w:t>
+      </w:r>
+      <w:r>
+        <w:t xml:space="preserve"> Different conditioning methods like simple concatenation, FILM or cross-attention will also be evaluated </w:t>
       </w:r>
       <w:sdt>
         <w:sdtPr>
           <w:alias w:val="To edit, see citavi.com/edit"/>
-          <w:tag w:val="CitaviPlaceholder#200d4af4-51a3-4501-985c-f35a4b06ff21"/>
-          <w:id w:val="-1918241047"/>
+          <w:tag w:val="CitaviPlaceholder#8f3fb170-0f48-4314-bbf5-fe65ca4ebb89"/>
+          <w:id w:val="-1524703915"/>
           <w:placeholder>
-            <w:docPart w:val="974F459B38BE4EC4B15956B314CF5259"/>
+            <w:docPart w:val="DefaultPlaceholder_-1854013440"/>
           </w:placeholder>
         </w:sdtPr>
         <w:sdtContent>
@@ -670,13 +820,13 @@
             <w:fldChar w:fldCharType="begin"/>
           </w:r>
           <w:r>
-            <w:instrText>ADDIN CitaviPlaceholder{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}</w:instrText>
+            <w:instrText>ADDIN CitaviPlaceholder{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}</w:instrText>
           </w:r>
           <w:r>
             <w:fldChar w:fldCharType="separate"/>
           </w:r>
           <w:r>
-            <w:t>[17]</w:t>
+            <w:t>[17, 18]</w:t>
           </w:r>
           <w:r>
             <w:fldChar w:fldCharType="end"/>
@@ -684,7 +834,13 @@
         </w:sdtContent>
       </w:sdt>
       <w:r>
-        <w:t xml:space="preserve"> an so on. </w:t>
+        <w:t xml:space="preserve">. </w:t>
+      </w:r>
+      <w:r>
+        <w:t xml:space="preserve"> But for the start of the project, we will keep the model as simple as possible to have a solid baseline that can be improved upon. For the first two weeks we will explore the provided training data </w:t>
+      </w:r>
+      <w:r>
+        <w:t xml:space="preserve">and decide which augmentations should be used if needed. Then we will start with a simple latent diffusion architecture that is unconditionally trained to reconstruct point clouds. For this we will rely on pretrained VAE first and test if this yields good results. This simple testing in the early stages also serves to compare U-Net based and transformer-based diffusion models. Based on the test results we are going to chose a model architecture and iteratively add more features like grasp conditioning to develop our model. </w:t>
       </w:r>
     </w:p>
     <w:p>
@@ -1112,11 +1268,27 @@
           <w:r>
             <w:tab/>
           </w:r>
-          <w:bookmarkStart w:id="16" w:name="_CTVL00144ba0cf3239a425b859fa2a5759665e6"/>
-          <w:r>
-            <w:t>"DDIM_2022,</w:t>
-          </w:r>
-          <w:bookmarkEnd w:id="16"/>
+          <w:bookmarkStart w:id="16" w:name="_CTVL001be55751c9dc44c42bfdb8913106b3c94"/>
+          <w:r>
+            <w:t>"Attention_is_all_you_need,"</w:t>
+          </w:r>
+        </w:p>
+        <w:bookmarkEnd w:id="16"/>
+        <w:p>
+          <w:pPr>
+            <w:pStyle w:val="CitaviBibliographyEntry"/>
+          </w:pPr>
+          <w:r>
+            <w:t>[18]</w:t>
+          </w:r>
+          <w:r>
+            <w:tab/>
+          </w:r>
+          <w:bookmarkStart w:id="17" w:name="_CTVL001f98d73704fde4701b5bded8cfcd49523"/>
+          <w:r>
+            <w:t>Ethan Perez, Florian Strub, Harm de Vries, Vincent Dumoulin, and Aaron Courville, "FiLM: Visual Reasoning with a General Conditioning Layer,</w:t>
+          </w:r>
+          <w:bookmarkEnd w:id="17"/>
           <w:r>
             <w:t>"</w:t>
           </w:r>
@@ -3968,6 +4140,7 @@
     <w:sig w:usb0="E4002EFF" w:usb1="C200247B" w:usb2="00000009" w:usb3="00000000" w:csb0="000001FF" w:csb1="00000000"/>
   </w:font>
   <w:font w:name="MS Mincho">
+    <w:altName w:val="ＭＳ 明朝"/>
     <w:panose1 w:val="02020609040205080304"/>
     <w:charset w:characterSet="shift_jis"/>
     <w:family w:val="modern"/>
@@ -4000,9 +4173,12 @@
   </w:compat>
   <w:rsids>
     <w:rsidRoot w:val="00A74657"/>
-    <w:rsid w:val="003C0BAD"/>
+    <w:rsid w:val="004E2826"/>
+    <w:rsid w:val="005A7817"/>
     <w:rsid w:val="00A74657"/>
     <w:rsid w:val="00BD7106"/>
+    <w:rsid w:val="00C95DB9"/>
+    <w:rsid w:val="00FC5256"/>
   </w:rsids>
   <m:mathPr>
     <m:mathFont m:val="Cambria Math"/>

</xml_diff>